<commit_message>
feat: hoàn thiện CSDL quản lý sản phẩm - thêm AUTO_INCREMENT cho các khóa chính - bổ sung UNIQUE cho dữ liệu quan trọng - bổ sung CHECK kiểm tra dữ liệu - thêm Status cho Employee và Warehouse - tối ưu khóa ngoại và Index - hoàn thiện 11 bảng
</commit_message>
<xml_diff>
--- a/baocao.docx
+++ b/baocao.docx
@@ -1,6 +1,6 @@
 
 <file path=word/document.xml><?xml version="1.0" encoding="utf-8"?>
-<w:document xmlns:wpc="http://schemas.microsoft.com/office/word/2010/wordprocessingCanvas" xmlns:mc="http://schemas.openxmlformats.org/markup-compatibility/2006" xmlns:o="urn:schemas-microsoft-com:office:office" xmlns:r="http://schemas.openxmlformats.org/officeDocument/2006/relationships" xmlns:m="http://schemas.openxmlformats.org/officeDocument/2006/math" xmlns:v="urn:schemas-microsoft-com:vml" xmlns:wp14="http://schemas.microsoft.com/office/word/2010/wordprocessingDrawing" xmlns:wp="http://schemas.openxmlformats.org/drawingml/2006/wordprocessingDrawing" xmlns:w10="urn:schemas-microsoft-com:office:word" xmlns:w="http://schemas.openxmlformats.org/wordprocessingml/2006/main" xmlns:w14="http://schemas.microsoft.com/office/word/2010/wordml" xmlns:w15="http://schemas.microsoft.com/office/word/2012/wordml" xmlns:wpg="http://schemas.microsoft.com/office/word/2010/wordprocessingGroup" xmlns:wpi="http://schemas.microsoft.com/office/word/2010/wordprocessingInk" xmlns:wne="http://schemas.microsoft.com/office/word/2006/wordml" xmlns:wps="http://schemas.microsoft.com/office/word/2010/wordprocessingShape" mc:Ignorable="w14 w15 wp14">
+<w:document xmlns:wpc="http://schemas.microsoft.com/office/word/2010/wordprocessingCanvas" xmlns:cx="http://schemas.microsoft.com/office/drawing/2014/chartex" xmlns:cx1="http://schemas.microsoft.com/office/drawing/2015/9/8/chartex" xmlns:cx2="http://schemas.microsoft.com/office/drawing/2015/10/21/chartex" xmlns:cx3="http://schemas.microsoft.com/office/drawing/2016/5/9/chartex" xmlns:cx4="http://schemas.microsoft.com/office/drawing/2016/5/10/chartex" xmlns:cx5="http://schemas.microsoft.com/office/drawing/2016/5/11/chartex" xmlns:cx6="http://schemas.microsoft.com/office/drawing/2016/5/12/chartex" xmlns:cx7="http://schemas.microsoft.com/office/drawing/2016/5/13/chartex" xmlns:cx8="http://schemas.microsoft.com/office/drawing/2016/5/14/chartex" xmlns:mc="http://schemas.openxmlformats.org/markup-compatibility/2006" xmlns:aink="http://schemas.microsoft.com/office/drawing/2016/ink" xmlns:am3d="http://schemas.microsoft.com/office/drawing/2017/model3d" xmlns:o="urn:schemas-microsoft-com:office:office" xmlns:oel="http://schemas.microsoft.com/office/2019/extlst" xmlns:r="http://schemas.openxmlformats.org/officeDocument/2006/relationships" xmlns:m="http://schemas.openxmlformats.org/officeDocument/2006/math" xmlns:v="urn:schemas-microsoft-com:vml" xmlns:wp14="http://schemas.microsoft.com/office/word/2010/wordprocessingDrawing" xmlns:wp="http://schemas.openxmlformats.org/drawingml/2006/wordprocessingDrawing" xmlns:w10="urn:schemas-microsoft-com:office:word" xmlns:w="http://schemas.openxmlformats.org/wordprocessingml/2006/main" xmlns:w14="http://schemas.microsoft.com/office/word/2010/wordml" xmlns:w15="http://schemas.microsoft.com/office/word/2012/wordml" xmlns:w16cex="http://schemas.microsoft.com/office/word/2018/wordml/cex" xmlns:w16cid="http://schemas.microsoft.com/office/word/2016/wordml/cid" xmlns:w16="http://schemas.microsoft.com/office/word/2018/wordml" xmlns:w16du="http://schemas.microsoft.com/office/word/2023/wordml/word16du" xmlns:w16sdtdh="http://schemas.microsoft.com/office/word/2020/wordml/sdtdatahash" xmlns:w16sdtfl="http://schemas.microsoft.com/office/word/2024/wordml/sdtformatlock" xmlns:w16se="http://schemas.microsoft.com/office/word/2015/wordml/symex" xmlns:wpg="http://schemas.microsoft.com/office/word/2010/wordprocessingGroup" xmlns:wpi="http://schemas.microsoft.com/office/word/2010/wordprocessingInk" xmlns:wne="http://schemas.microsoft.com/office/word/2006/wordml" xmlns:wps="http://schemas.microsoft.com/office/word/2010/wordprocessingShape" mc:Ignorable="w14 w15 w16se w16cid w16 w16cex w16sdtdh w16sdtfl w16du wp14">
   <w:body>
     <w:p>
       <w:pPr>
@@ -53,7 +53,7 @@
           <w:noProof/>
         </w:rPr>
         <w:drawing>
-          <wp:inline distT="0" distB="0" distL="0" distR="0">
+          <wp:inline distT="0" distB="0" distL="0" distR="0" wp14:anchorId="511BACB1" wp14:editId="2DBCF218">
             <wp:extent cx="841911" cy="841911"/>
             <wp:effectExtent l="0" t="0" r="0" b="0"/>
             <wp:docPr id="1" name="Picture 1"/>
@@ -936,10 +936,7 @@
         </w:rPr>
       </w:pPr>
       <w:r>
-        <w:t xml:space="preserve">Thực thể </w:t>
-      </w:r>
-      <w:r>
-        <w:t>Category</w:t>
+        <w:t>Thực thể Category</w:t>
       </w:r>
       <w:r>
         <w:rPr>
@@ -1044,11 +1041,11 @@
         <w:tblLook w:val="04A0" w:firstRow="1" w:lastRow="0" w:firstColumn="1" w:lastColumn="0" w:noHBand="0" w:noVBand="1"/>
       </w:tblPr>
       <w:tblGrid>
-        <w:gridCol w:w="1060"/>
-        <w:gridCol w:w="1953"/>
-        <w:gridCol w:w="1927"/>
-        <w:gridCol w:w="2239"/>
-        <w:gridCol w:w="1599"/>
+        <w:gridCol w:w="1035"/>
+        <w:gridCol w:w="1941"/>
+        <w:gridCol w:w="1844"/>
+        <w:gridCol w:w="2225"/>
+        <w:gridCol w:w="1733"/>
       </w:tblGrid>
       <w:tr>
         <w:trPr>
@@ -1210,7 +1207,7 @@
               <w:rPr>
                 <w:lang w:val="vi-VN"/>
               </w:rPr>
-              <w:t>PK</w:t>
+              <w:t>PK, INCREMNET</w:t>
             </w:r>
           </w:p>
         </w:tc>
@@ -1288,7 +1285,7 @@
               <w:rPr>
                 <w:lang w:val="vi-VN"/>
               </w:rPr>
-              <w:t>NVARCHAR(100)</w:t>
+              <w:t>VARCHAR(100)</w:t>
             </w:r>
           </w:p>
         </w:tc>
@@ -1385,7 +1382,7 @@
               <w:rPr>
                 <w:lang w:val="vi-VN"/>
               </w:rPr>
-              <w:t>NVARCHAR(255)</w:t>
+              <w:t>VARCHAR(255)</w:t>
             </w:r>
           </w:p>
         </w:tc>
@@ -1500,11 +1497,11 @@
         <w:tblLook w:val="04A0" w:firstRow="1" w:lastRow="0" w:firstColumn="1" w:lastColumn="0" w:noHBand="0" w:noVBand="1"/>
       </w:tblPr>
       <w:tblGrid>
-        <w:gridCol w:w="943"/>
-        <w:gridCol w:w="1940"/>
-        <w:gridCol w:w="2055"/>
+        <w:gridCol w:w="862"/>
+        <w:gridCol w:w="1864"/>
+        <w:gridCol w:w="1638"/>
+        <w:gridCol w:w="2175"/>
         <w:gridCol w:w="2239"/>
-        <w:gridCol w:w="1601"/>
       </w:tblGrid>
       <w:tr>
         <w:trPr>
@@ -1698,7 +1695,7 @@
               <w:rPr>
                 <w:lang w:val="vi-VN"/>
               </w:rPr>
-              <w:t>PK</w:t>
+              <w:t>PK, AU_INCREMENT</w:t>
             </w:r>
           </w:p>
         </w:tc>
@@ -1776,7 +1773,7 @@
               <w:rPr>
                 <w:lang w:val="vi-VN"/>
               </w:rPr>
-              <w:t>NVARCHAR(150)</w:t>
+              <w:t>VARCHAR(150)</w:t>
             </w:r>
           </w:p>
         </w:tc>
@@ -2062,7 +2059,7 @@
               <w:rPr>
                 <w:lang w:val="vi-VN"/>
               </w:rPr>
-              <w:t>NVARCHAR(255)</w:t>
+              <w:t>VARCHAR(255)</w:t>
             </w:r>
           </w:p>
         </w:tc>
@@ -2121,11 +2118,11 @@
         <w:tblLook w:val="04A0" w:firstRow="1" w:lastRow="0" w:firstColumn="1" w:lastColumn="0" w:noHBand="0" w:noVBand="1"/>
       </w:tblPr>
       <w:tblGrid>
-        <w:gridCol w:w="1548"/>
+        <w:gridCol w:w="1291"/>
         <w:gridCol w:w="1848"/>
-        <w:gridCol w:w="1574"/>
+        <w:gridCol w:w="1349"/>
+        <w:gridCol w:w="2051"/>
         <w:gridCol w:w="2239"/>
-        <w:gridCol w:w="1569"/>
       </w:tblGrid>
       <w:tr>
         <w:trPr>
@@ -2319,12 +2316,10 @@
               <w:rPr>
                 <w:lang w:val="vi-VN"/>
               </w:rPr>
-              <w:t>PK</w:t>
-            </w:r>
-          </w:p>
-        </w:tc>
-        <w:bookmarkStart w:id="0" w:name="_GoBack"/>
-        <w:bookmarkEnd w:id="0"/>
+              <w:t>PK, AU_INCREMENT</w:t>
+            </w:r>
+          </w:p>
+        </w:tc>
       </w:tr>
       <w:tr>
         <w:tc>
@@ -2399,7 +2394,7 @@
               <w:rPr>
                 <w:lang w:val="vi-VN"/>
               </w:rPr>
-              <w:t>NVARCHAR(150)</w:t>
+              <w:t>VARCHAR(150)</w:t>
             </w:r>
           </w:p>
         </w:tc>
@@ -2690,19 +2685,2587 @@
               <w:rPr>
                 <w:lang w:val="vi-VN"/>
               </w:rPr>
-              <w:t>NVARCHAR(255</w:t>
-            </w:r>
-            <w:r>
-              <w:rPr>
-                <w:lang w:val="vi-VN"/>
-              </w:rPr>
-              <w:t>)</w:t>
+              <w:t>VARCHAR(255)</w:t>
             </w:r>
           </w:p>
         </w:tc>
         <w:tc>
           <w:tcPr>
             <w:tcW w:w="1756" w:type="dxa"/>
+          </w:tcPr>
+          <w:p>
+            <w:pPr>
+              <w:cnfStyle w:val="000000000000" w:firstRow="0" w:lastRow="0" w:firstColumn="0" w:lastColumn="0" w:oddVBand="0" w:evenVBand="0" w:oddHBand="0" w:evenHBand="0" w:firstRowFirstColumn="0" w:firstRowLastColumn="0" w:lastRowFirstColumn="0" w:lastRowLastColumn="0"/>
+              <w:rPr>
+                <w:lang w:val="vi-VN"/>
+              </w:rPr>
+            </w:pPr>
+          </w:p>
+        </w:tc>
+      </w:tr>
+    </w:tbl>
+    <w:p>
+      <w:pPr>
+        <w:rPr>
+          <w:lang w:val="vi-VN"/>
+        </w:rPr>
+      </w:pPr>
+    </w:p>
+    <w:p>
+      <w:pPr>
+        <w:rPr>
+          <w:lang w:val="vi-VN"/>
+        </w:rPr>
+      </w:pPr>
+      <w:r>
+        <w:rPr>
+          <w:lang w:val="vi-VN"/>
+        </w:rPr>
+        <w:t>Thực thể Employee</w:t>
+      </w:r>
+    </w:p>
+    <w:p>
+      <w:r>
+        <w:t>Lưu thông tin nhân viên thực hiện các nghiệp vụ trong hệ thống.</w:t>
+      </w:r>
+    </w:p>
+    <w:p>
+      <w:r>
+        <w:t>Nhân viên có thể thực hiện:</w:t>
+      </w:r>
+    </w:p>
+    <w:p>
+      <w:pPr>
+        <w:numPr>
+          <w:ilvl w:val="0"/>
+          <w:numId w:val="6"/>
+        </w:numPr>
+      </w:pPr>
+      <w:r>
+        <w:t xml:space="preserve">Lập đơn hàng. </w:t>
+      </w:r>
+    </w:p>
+    <w:p>
+      <w:pPr>
+        <w:numPr>
+          <w:ilvl w:val="0"/>
+          <w:numId w:val="6"/>
+        </w:numPr>
+      </w:pPr>
+      <w:r>
+        <w:t>Lập phiếu nhập hàng.</w:t>
+      </w:r>
+    </w:p>
+    <w:tbl>
+      <w:tblPr>
+        <w:tblStyle w:val="myTable"/>
+        <w:tblW w:w="0" w:type="auto"/>
+        <w:tblLook w:val="04A0" w:firstRow="1" w:lastRow="0" w:firstColumn="1" w:lastColumn="0" w:noHBand="0" w:noVBand="1"/>
+      </w:tblPr>
+      <w:tblGrid>
+        <w:gridCol w:w="747"/>
+        <w:gridCol w:w="1891"/>
+        <w:gridCol w:w="1504"/>
+        <w:gridCol w:w="2051"/>
+        <w:gridCol w:w="2585"/>
+      </w:tblGrid>
+      <w:tr>
+        <w:trPr>
+          <w:cnfStyle w:val="100000000000" w:firstRow="1" w:lastRow="0" w:firstColumn="0" w:lastColumn="0" w:oddVBand="0" w:evenVBand="0" w:oddHBand="0" w:evenHBand="0" w:firstRowFirstColumn="0" w:firstRowLastColumn="0" w:lastRowFirstColumn="0" w:lastRowLastColumn="0"/>
+        </w:trPr>
+        <w:tc>
+          <w:tcPr>
+            <w:cnfStyle w:val="001000000000" w:firstRow="0" w:lastRow="0" w:firstColumn="1" w:lastColumn="0" w:oddVBand="0" w:evenVBand="0" w:oddHBand="0" w:evenHBand="0" w:firstRowFirstColumn="0" w:firstRowLastColumn="0" w:lastRowFirstColumn="0" w:lastRowLastColumn="0"/>
+            <w:tcW w:w="747" w:type="dxa"/>
+          </w:tcPr>
+          <w:p>
+            <w:pPr>
+              <w:rPr>
+                <w:lang w:val="vi-VN"/>
+              </w:rPr>
+            </w:pPr>
+            <w:r>
+              <w:rPr>
+                <w:lang w:val="vi-VN"/>
+              </w:rPr>
+              <w:t>STT</w:t>
+            </w:r>
+          </w:p>
+        </w:tc>
+        <w:tc>
+          <w:tcPr>
+            <w:tcW w:w="1891" w:type="dxa"/>
+          </w:tcPr>
+          <w:p>
+            <w:pPr>
+              <w:cnfStyle w:val="100000000000" w:firstRow="1" w:lastRow="0" w:firstColumn="0" w:lastColumn="0" w:oddVBand="0" w:evenVBand="0" w:oddHBand="0" w:evenHBand="0" w:firstRowFirstColumn="0" w:firstRowLastColumn="0" w:lastRowFirstColumn="0" w:lastRowLastColumn="0"/>
+              <w:rPr>
+                <w:lang w:val="vi-VN"/>
+              </w:rPr>
+            </w:pPr>
+            <w:r>
+              <w:rPr>
+                <w:lang w:val="vi-VN"/>
+              </w:rPr>
+              <w:t>Thuộc tính</w:t>
+            </w:r>
+          </w:p>
+        </w:tc>
+        <w:tc>
+          <w:tcPr>
+            <w:tcW w:w="1504" w:type="dxa"/>
+          </w:tcPr>
+          <w:p>
+            <w:pPr>
+              <w:cnfStyle w:val="100000000000" w:firstRow="1" w:lastRow="0" w:firstColumn="0" w:lastColumn="0" w:oddVBand="0" w:evenVBand="0" w:oddHBand="0" w:evenHBand="0" w:firstRowFirstColumn="0" w:firstRowLastColumn="0" w:lastRowFirstColumn="0" w:lastRowLastColumn="0"/>
+              <w:rPr>
+                <w:lang w:val="vi-VN"/>
+              </w:rPr>
+            </w:pPr>
+            <w:r>
+              <w:rPr>
+                <w:lang w:val="vi-VN"/>
+              </w:rPr>
+              <w:t>Diễn giải</w:t>
+            </w:r>
+          </w:p>
+        </w:tc>
+        <w:tc>
+          <w:tcPr>
+            <w:tcW w:w="2051" w:type="dxa"/>
+          </w:tcPr>
+          <w:p>
+            <w:pPr>
+              <w:cnfStyle w:val="100000000000" w:firstRow="1" w:lastRow="0" w:firstColumn="0" w:lastColumn="0" w:oddVBand="0" w:evenVBand="0" w:oddHBand="0" w:evenHBand="0" w:firstRowFirstColumn="0" w:firstRowLastColumn="0" w:lastRowFirstColumn="0" w:lastRowLastColumn="0"/>
+              <w:rPr>
+                <w:lang w:val="vi-VN"/>
+              </w:rPr>
+            </w:pPr>
+            <w:r>
+              <w:rPr>
+                <w:lang w:val="vi-VN"/>
+              </w:rPr>
+              <w:t>Kiểu dữ liệu</w:t>
+            </w:r>
+          </w:p>
+        </w:tc>
+        <w:tc>
+          <w:tcPr>
+            <w:tcW w:w="2585" w:type="dxa"/>
+          </w:tcPr>
+          <w:p>
+            <w:pPr>
+              <w:cnfStyle w:val="100000000000" w:firstRow="1" w:lastRow="0" w:firstColumn="0" w:lastColumn="0" w:oddVBand="0" w:evenVBand="0" w:oddHBand="0" w:evenHBand="0" w:firstRowFirstColumn="0" w:firstRowLastColumn="0" w:lastRowFirstColumn="0" w:lastRowLastColumn="0"/>
+              <w:rPr>
+                <w:lang w:val="vi-VN"/>
+              </w:rPr>
+            </w:pPr>
+            <w:r>
+              <w:rPr>
+                <w:lang w:val="vi-VN"/>
+              </w:rPr>
+              <w:t>Ràng buộc</w:t>
+            </w:r>
+          </w:p>
+        </w:tc>
+      </w:tr>
+      <w:tr>
+        <w:tc>
+          <w:tcPr>
+            <w:cnfStyle w:val="001000000000" w:firstRow="0" w:lastRow="0" w:firstColumn="1" w:lastColumn="0" w:oddVBand="0" w:evenVBand="0" w:oddHBand="0" w:evenHBand="0" w:firstRowFirstColumn="0" w:firstRowLastColumn="0" w:lastRowFirstColumn="0" w:lastRowLastColumn="0"/>
+            <w:tcW w:w="747" w:type="dxa"/>
+          </w:tcPr>
+          <w:p>
+            <w:pPr>
+              <w:rPr>
+                <w:lang w:val="vi-VN"/>
+              </w:rPr>
+            </w:pPr>
+            <w:r>
+              <w:rPr>
+                <w:lang w:val="vi-VN"/>
+              </w:rPr>
+              <w:t>1</w:t>
+            </w:r>
+          </w:p>
+        </w:tc>
+        <w:tc>
+          <w:tcPr>
+            <w:tcW w:w="1891" w:type="dxa"/>
+          </w:tcPr>
+          <w:p>
+            <w:pPr>
+              <w:cnfStyle w:val="000000000000" w:firstRow="0" w:lastRow="0" w:firstColumn="0" w:lastColumn="0" w:oddVBand="0" w:evenVBand="0" w:oddHBand="0" w:evenHBand="0" w:firstRowFirstColumn="0" w:firstRowLastColumn="0" w:lastRowFirstColumn="0" w:lastRowLastColumn="0"/>
+              <w:rPr>
+                <w:lang w:val="vi-VN"/>
+              </w:rPr>
+            </w:pPr>
+            <w:r>
+              <w:rPr>
+                <w:lang w:val="vi-VN"/>
+              </w:rPr>
+              <w:t>EmployeeId</w:t>
+            </w:r>
+          </w:p>
+        </w:tc>
+        <w:tc>
+          <w:tcPr>
+            <w:tcW w:w="1504" w:type="dxa"/>
+          </w:tcPr>
+          <w:p>
+            <w:pPr>
+              <w:cnfStyle w:val="000000000000" w:firstRow="0" w:lastRow="0" w:firstColumn="0" w:lastColumn="0" w:oddVBand="0" w:evenVBand="0" w:oddHBand="0" w:evenHBand="0" w:firstRowFirstColumn="0" w:firstRowLastColumn="0" w:lastRowFirstColumn="0" w:lastRowLastColumn="0"/>
+              <w:rPr>
+                <w:lang w:val="vi-VN"/>
+              </w:rPr>
+            </w:pPr>
+            <w:r>
+              <w:rPr>
+                <w:lang w:val="vi-VN"/>
+              </w:rPr>
+              <w:t>Mã nhân viên</w:t>
+            </w:r>
+          </w:p>
+        </w:tc>
+        <w:tc>
+          <w:tcPr>
+            <w:tcW w:w="2051" w:type="dxa"/>
+          </w:tcPr>
+          <w:p>
+            <w:pPr>
+              <w:cnfStyle w:val="000000000000" w:firstRow="0" w:lastRow="0" w:firstColumn="0" w:lastColumn="0" w:oddVBand="0" w:evenVBand="0" w:oddHBand="0" w:evenHBand="0" w:firstRowFirstColumn="0" w:firstRowLastColumn="0" w:lastRowFirstColumn="0" w:lastRowLastColumn="0"/>
+              <w:rPr>
+                <w:lang w:val="vi-VN"/>
+              </w:rPr>
+            </w:pPr>
+            <w:r>
+              <w:rPr>
+                <w:lang w:val="vi-VN"/>
+              </w:rPr>
+              <w:t>INT</w:t>
+            </w:r>
+          </w:p>
+        </w:tc>
+        <w:tc>
+          <w:tcPr>
+            <w:tcW w:w="2585" w:type="dxa"/>
+          </w:tcPr>
+          <w:p>
+            <w:pPr>
+              <w:cnfStyle w:val="000000000000" w:firstRow="0" w:lastRow="0" w:firstColumn="0" w:lastColumn="0" w:oddVBand="0" w:evenVBand="0" w:oddHBand="0" w:evenHBand="0" w:firstRowFirstColumn="0" w:firstRowLastColumn="0" w:lastRowFirstColumn="0" w:lastRowLastColumn="0"/>
+              <w:rPr>
+                <w:lang w:val="vi-VN"/>
+              </w:rPr>
+            </w:pPr>
+            <w:r>
+              <w:rPr>
+                <w:lang w:val="vi-VN"/>
+              </w:rPr>
+              <w:t>PK, AUTO_INCREMENT</w:t>
+            </w:r>
+          </w:p>
+        </w:tc>
+      </w:tr>
+      <w:tr>
+        <w:tc>
+          <w:tcPr>
+            <w:cnfStyle w:val="001000000000" w:firstRow="0" w:lastRow="0" w:firstColumn="1" w:lastColumn="0" w:oddVBand="0" w:evenVBand="0" w:oddHBand="0" w:evenHBand="0" w:firstRowFirstColumn="0" w:firstRowLastColumn="0" w:lastRowFirstColumn="0" w:lastRowLastColumn="0"/>
+            <w:tcW w:w="747" w:type="dxa"/>
+          </w:tcPr>
+          <w:p>
+            <w:pPr>
+              <w:rPr>
+                <w:lang w:val="vi-VN"/>
+              </w:rPr>
+            </w:pPr>
+            <w:r>
+              <w:rPr>
+                <w:lang w:val="vi-VN"/>
+              </w:rPr>
+              <w:lastRenderedPageBreak/>
+              <w:t>2</w:t>
+            </w:r>
+          </w:p>
+        </w:tc>
+        <w:tc>
+          <w:tcPr>
+            <w:tcW w:w="1891" w:type="dxa"/>
+          </w:tcPr>
+          <w:p>
+            <w:pPr>
+              <w:cnfStyle w:val="000000000000" w:firstRow="0" w:lastRow="0" w:firstColumn="0" w:lastColumn="0" w:oddVBand="0" w:evenVBand="0" w:oddHBand="0" w:evenHBand="0" w:firstRowFirstColumn="0" w:firstRowLastColumn="0" w:lastRowFirstColumn="0" w:lastRowLastColumn="0"/>
+              <w:rPr>
+                <w:lang w:val="vi-VN"/>
+              </w:rPr>
+            </w:pPr>
+            <w:r>
+              <w:rPr>
+                <w:lang w:val="vi-VN"/>
+              </w:rPr>
+              <w:t>EmployeeName</w:t>
+            </w:r>
+          </w:p>
+        </w:tc>
+        <w:tc>
+          <w:tcPr>
+            <w:tcW w:w="1504" w:type="dxa"/>
+          </w:tcPr>
+          <w:p>
+            <w:pPr>
+              <w:cnfStyle w:val="000000000000" w:firstRow="0" w:lastRow="0" w:firstColumn="0" w:lastColumn="0" w:oddVBand="0" w:evenVBand="0" w:oddHBand="0" w:evenHBand="0" w:firstRowFirstColumn="0" w:firstRowLastColumn="0" w:lastRowFirstColumn="0" w:lastRowLastColumn="0"/>
+              <w:rPr>
+                <w:lang w:val="vi-VN"/>
+              </w:rPr>
+            </w:pPr>
+            <w:r>
+              <w:rPr>
+                <w:lang w:val="vi-VN"/>
+              </w:rPr>
+              <w:t>Tên nhân viên</w:t>
+            </w:r>
+          </w:p>
+        </w:tc>
+        <w:tc>
+          <w:tcPr>
+            <w:tcW w:w="2051" w:type="dxa"/>
+          </w:tcPr>
+          <w:p>
+            <w:pPr>
+              <w:cnfStyle w:val="000000000000" w:firstRow="0" w:lastRow="0" w:firstColumn="0" w:lastColumn="0" w:oddVBand="0" w:evenVBand="0" w:oddHBand="0" w:evenHBand="0" w:firstRowFirstColumn="0" w:firstRowLastColumn="0" w:lastRowFirstColumn="0" w:lastRowLastColumn="0"/>
+              <w:rPr>
+                <w:lang w:val="vi-VN"/>
+              </w:rPr>
+            </w:pPr>
+            <w:r>
+              <w:rPr>
+                <w:lang w:val="vi-VN"/>
+              </w:rPr>
+              <w:t>VARCHAR(150)</w:t>
+            </w:r>
+          </w:p>
+        </w:tc>
+        <w:tc>
+          <w:tcPr>
+            <w:tcW w:w="2585" w:type="dxa"/>
+          </w:tcPr>
+          <w:p>
+            <w:pPr>
+              <w:cnfStyle w:val="000000000000" w:firstRow="0" w:lastRow="0" w:firstColumn="0" w:lastColumn="0" w:oddVBand="0" w:evenVBand="0" w:oddHBand="0" w:evenHBand="0" w:firstRowFirstColumn="0" w:firstRowLastColumn="0" w:lastRowFirstColumn="0" w:lastRowLastColumn="0"/>
+              <w:rPr>
+                <w:lang w:val="vi-VN"/>
+              </w:rPr>
+            </w:pPr>
+            <w:r>
+              <w:rPr>
+                <w:lang w:val="vi-VN"/>
+              </w:rPr>
+              <w:t>Not null</w:t>
+            </w:r>
+          </w:p>
+        </w:tc>
+      </w:tr>
+      <w:tr>
+        <w:tc>
+          <w:tcPr>
+            <w:cnfStyle w:val="001000000000" w:firstRow="0" w:lastRow="0" w:firstColumn="1" w:lastColumn="0" w:oddVBand="0" w:evenVBand="0" w:oddHBand="0" w:evenHBand="0" w:firstRowFirstColumn="0" w:firstRowLastColumn="0" w:lastRowFirstColumn="0" w:lastRowLastColumn="0"/>
+            <w:tcW w:w="747" w:type="dxa"/>
+          </w:tcPr>
+          <w:p>
+            <w:pPr>
+              <w:rPr>
+                <w:lang w:val="vi-VN"/>
+              </w:rPr>
+            </w:pPr>
+            <w:r>
+              <w:rPr>
+                <w:lang w:val="vi-VN"/>
+              </w:rPr>
+              <w:t>3</w:t>
+            </w:r>
+          </w:p>
+        </w:tc>
+        <w:tc>
+          <w:tcPr>
+            <w:tcW w:w="1891" w:type="dxa"/>
+          </w:tcPr>
+          <w:p>
+            <w:pPr>
+              <w:cnfStyle w:val="000000000000" w:firstRow="0" w:lastRow="0" w:firstColumn="0" w:lastColumn="0" w:oddVBand="0" w:evenVBand="0" w:oddHBand="0" w:evenHBand="0" w:firstRowFirstColumn="0" w:firstRowLastColumn="0" w:lastRowFirstColumn="0" w:lastRowLastColumn="0"/>
+              <w:rPr>
+                <w:lang w:val="vi-VN"/>
+              </w:rPr>
+            </w:pPr>
+            <w:r>
+              <w:rPr>
+                <w:lang w:val="vi-VN"/>
+              </w:rPr>
+              <w:t>Phone</w:t>
+            </w:r>
+          </w:p>
+        </w:tc>
+        <w:tc>
+          <w:tcPr>
+            <w:tcW w:w="1504" w:type="dxa"/>
+          </w:tcPr>
+          <w:p>
+            <w:pPr>
+              <w:cnfStyle w:val="000000000000" w:firstRow="0" w:lastRow="0" w:firstColumn="0" w:lastColumn="0" w:oddVBand="0" w:evenVBand="0" w:oddHBand="0" w:evenHBand="0" w:firstRowFirstColumn="0" w:firstRowLastColumn="0" w:lastRowFirstColumn="0" w:lastRowLastColumn="0"/>
+              <w:rPr>
+                <w:lang w:val="vi-VN"/>
+              </w:rPr>
+            </w:pPr>
+            <w:r>
+              <w:rPr>
+                <w:lang w:val="vi-VN"/>
+              </w:rPr>
+              <w:t>Điện thoại nhân viên</w:t>
+            </w:r>
+          </w:p>
+        </w:tc>
+        <w:tc>
+          <w:tcPr>
+            <w:tcW w:w="2051" w:type="dxa"/>
+          </w:tcPr>
+          <w:p>
+            <w:pPr>
+              <w:cnfStyle w:val="000000000000" w:firstRow="0" w:lastRow="0" w:firstColumn="0" w:lastColumn="0" w:oddVBand="0" w:evenVBand="0" w:oddHBand="0" w:evenHBand="0" w:firstRowFirstColumn="0" w:firstRowLastColumn="0" w:lastRowFirstColumn="0" w:lastRowLastColumn="0"/>
+              <w:rPr>
+                <w:lang w:val="vi-VN"/>
+              </w:rPr>
+            </w:pPr>
+            <w:r>
+              <w:rPr>
+                <w:lang w:val="vi-VN"/>
+              </w:rPr>
+              <w:t>VARCHAR(20)</w:t>
+            </w:r>
+          </w:p>
+        </w:tc>
+        <w:tc>
+          <w:tcPr>
+            <w:tcW w:w="2585" w:type="dxa"/>
+          </w:tcPr>
+          <w:p>
+            <w:pPr>
+              <w:cnfStyle w:val="000000000000" w:firstRow="0" w:lastRow="0" w:firstColumn="0" w:lastColumn="0" w:oddVBand="0" w:evenVBand="0" w:oddHBand="0" w:evenHBand="0" w:firstRowFirstColumn="0" w:firstRowLastColumn="0" w:lastRowFirstColumn="0" w:lastRowLastColumn="0"/>
+              <w:rPr>
+                <w:lang w:val="vi-VN"/>
+              </w:rPr>
+            </w:pPr>
+            <w:r>
+              <w:rPr>
+                <w:lang w:val="vi-VN"/>
+              </w:rPr>
+              <w:t>Not null</w:t>
+            </w:r>
+          </w:p>
+        </w:tc>
+      </w:tr>
+      <w:tr>
+        <w:tc>
+          <w:tcPr>
+            <w:cnfStyle w:val="001000000000" w:firstRow="0" w:lastRow="0" w:firstColumn="1" w:lastColumn="0" w:oddVBand="0" w:evenVBand="0" w:oddHBand="0" w:evenHBand="0" w:firstRowFirstColumn="0" w:firstRowLastColumn="0" w:lastRowFirstColumn="0" w:lastRowLastColumn="0"/>
+            <w:tcW w:w="747" w:type="dxa"/>
+          </w:tcPr>
+          <w:p>
+            <w:pPr>
+              <w:rPr>
+                <w:lang w:val="vi-VN"/>
+              </w:rPr>
+            </w:pPr>
+            <w:r>
+              <w:rPr>
+                <w:lang w:val="vi-VN"/>
+              </w:rPr>
+              <w:t>4</w:t>
+            </w:r>
+          </w:p>
+        </w:tc>
+        <w:tc>
+          <w:tcPr>
+            <w:tcW w:w="1891" w:type="dxa"/>
+          </w:tcPr>
+          <w:p>
+            <w:pPr>
+              <w:cnfStyle w:val="000000000000" w:firstRow="0" w:lastRow="0" w:firstColumn="0" w:lastColumn="0" w:oddVBand="0" w:evenVBand="0" w:oddHBand="0" w:evenHBand="0" w:firstRowFirstColumn="0" w:firstRowLastColumn="0" w:lastRowFirstColumn="0" w:lastRowLastColumn="0"/>
+              <w:rPr>
+                <w:lang w:val="vi-VN"/>
+              </w:rPr>
+            </w:pPr>
+            <w:r>
+              <w:rPr>
+                <w:lang w:val="vi-VN"/>
+              </w:rPr>
+              <w:t>Email</w:t>
+            </w:r>
+          </w:p>
+        </w:tc>
+        <w:tc>
+          <w:tcPr>
+            <w:tcW w:w="1504" w:type="dxa"/>
+          </w:tcPr>
+          <w:p>
+            <w:pPr>
+              <w:cnfStyle w:val="000000000000" w:firstRow="0" w:lastRow="0" w:firstColumn="0" w:lastColumn="0" w:oddVBand="0" w:evenVBand="0" w:oddHBand="0" w:evenHBand="0" w:firstRowFirstColumn="0" w:firstRowLastColumn="0" w:lastRowFirstColumn="0" w:lastRowLastColumn="0"/>
+              <w:rPr>
+                <w:lang w:val="vi-VN"/>
+              </w:rPr>
+            </w:pPr>
+            <w:r>
+              <w:rPr>
+                <w:lang w:val="vi-VN"/>
+              </w:rPr>
+              <w:t>Email nhân viên</w:t>
+            </w:r>
+          </w:p>
+        </w:tc>
+        <w:tc>
+          <w:tcPr>
+            <w:tcW w:w="2051" w:type="dxa"/>
+          </w:tcPr>
+          <w:p>
+            <w:pPr>
+              <w:cnfStyle w:val="000000000000" w:firstRow="0" w:lastRow="0" w:firstColumn="0" w:lastColumn="0" w:oddVBand="0" w:evenVBand="0" w:oddHBand="0" w:evenHBand="0" w:firstRowFirstColumn="0" w:firstRowLastColumn="0" w:lastRowFirstColumn="0" w:lastRowLastColumn="0"/>
+              <w:rPr>
+                <w:lang w:val="vi-VN"/>
+              </w:rPr>
+            </w:pPr>
+            <w:r>
+              <w:rPr>
+                <w:lang w:val="vi-VN"/>
+              </w:rPr>
+              <w:t>VARCHAR(100)</w:t>
+            </w:r>
+          </w:p>
+        </w:tc>
+        <w:tc>
+          <w:tcPr>
+            <w:tcW w:w="2585" w:type="dxa"/>
+          </w:tcPr>
+          <w:p>
+            <w:pPr>
+              <w:cnfStyle w:val="000000000000" w:firstRow="0" w:lastRow="0" w:firstColumn="0" w:lastColumn="0" w:oddVBand="0" w:evenVBand="0" w:oddHBand="0" w:evenHBand="0" w:firstRowFirstColumn="0" w:firstRowLastColumn="0" w:lastRowFirstColumn="0" w:lastRowLastColumn="0"/>
+              <w:rPr>
+                <w:lang w:val="vi-VN"/>
+              </w:rPr>
+            </w:pPr>
+          </w:p>
+        </w:tc>
+      </w:tr>
+      <w:tr>
+        <w:tc>
+          <w:tcPr>
+            <w:cnfStyle w:val="001000000000" w:firstRow="0" w:lastRow="0" w:firstColumn="1" w:lastColumn="0" w:oddVBand="0" w:evenVBand="0" w:oddHBand="0" w:evenHBand="0" w:firstRowFirstColumn="0" w:firstRowLastColumn="0" w:lastRowFirstColumn="0" w:lastRowLastColumn="0"/>
+            <w:tcW w:w="747" w:type="dxa"/>
+          </w:tcPr>
+          <w:p>
+            <w:pPr>
+              <w:rPr>
+                <w:lang w:val="vi-VN"/>
+              </w:rPr>
+            </w:pPr>
+            <w:r>
+              <w:rPr>
+                <w:lang w:val="vi-VN"/>
+              </w:rPr>
+              <w:t>5</w:t>
+            </w:r>
+          </w:p>
+        </w:tc>
+        <w:tc>
+          <w:tcPr>
+            <w:tcW w:w="1891" w:type="dxa"/>
+          </w:tcPr>
+          <w:p>
+            <w:pPr>
+              <w:cnfStyle w:val="000000000000" w:firstRow="0" w:lastRow="0" w:firstColumn="0" w:lastColumn="0" w:oddVBand="0" w:evenVBand="0" w:oddHBand="0" w:evenHBand="0" w:firstRowFirstColumn="0" w:firstRowLastColumn="0" w:lastRowFirstColumn="0" w:lastRowLastColumn="0"/>
+              <w:rPr>
+                <w:lang w:val="vi-VN"/>
+              </w:rPr>
+            </w:pPr>
+            <w:r>
+              <w:rPr>
+                <w:lang w:val="vi-VN"/>
+              </w:rPr>
+              <w:t>Position</w:t>
+            </w:r>
+          </w:p>
+        </w:tc>
+        <w:tc>
+          <w:tcPr>
+            <w:tcW w:w="1504" w:type="dxa"/>
+          </w:tcPr>
+          <w:p>
+            <w:pPr>
+              <w:cnfStyle w:val="000000000000" w:firstRow="0" w:lastRow="0" w:firstColumn="0" w:lastColumn="0" w:oddVBand="0" w:evenVBand="0" w:oddHBand="0" w:evenHBand="0" w:firstRowFirstColumn="0" w:firstRowLastColumn="0" w:lastRowFirstColumn="0" w:lastRowLastColumn="0"/>
+              <w:rPr>
+                <w:lang w:val="vi-VN"/>
+              </w:rPr>
+            </w:pPr>
+            <w:r>
+              <w:rPr>
+                <w:lang w:val="vi-VN"/>
+              </w:rPr>
+              <w:t>Chức vụ nhân viên</w:t>
+            </w:r>
+          </w:p>
+        </w:tc>
+        <w:tc>
+          <w:tcPr>
+            <w:tcW w:w="2051" w:type="dxa"/>
+          </w:tcPr>
+          <w:p>
+            <w:pPr>
+              <w:cnfStyle w:val="000000000000" w:firstRow="0" w:lastRow="0" w:firstColumn="0" w:lastColumn="0" w:oddVBand="0" w:evenVBand="0" w:oddHBand="0" w:evenHBand="0" w:firstRowFirstColumn="0" w:firstRowLastColumn="0" w:lastRowFirstColumn="0" w:lastRowLastColumn="0"/>
+              <w:rPr>
+                <w:lang w:val="vi-VN"/>
+              </w:rPr>
+            </w:pPr>
+            <w:r>
+              <w:rPr>
+                <w:lang w:val="vi-VN"/>
+              </w:rPr>
+              <w:t>VARCHAR(50)</w:t>
+            </w:r>
+          </w:p>
+        </w:tc>
+        <w:tc>
+          <w:tcPr>
+            <w:tcW w:w="2585" w:type="dxa"/>
+          </w:tcPr>
+          <w:p>
+            <w:pPr>
+              <w:cnfStyle w:val="000000000000" w:firstRow="0" w:lastRow="0" w:firstColumn="0" w:lastColumn="0" w:oddVBand="0" w:evenVBand="0" w:oddHBand="0" w:evenHBand="0" w:firstRowFirstColumn="0" w:firstRowLastColumn="0" w:lastRowFirstColumn="0" w:lastRowLastColumn="0"/>
+              <w:rPr>
+                <w:lang w:val="vi-VN"/>
+              </w:rPr>
+            </w:pPr>
+            <w:r>
+              <w:rPr>
+                <w:lang w:val="vi-VN"/>
+              </w:rPr>
+              <w:t>Not null</w:t>
+            </w:r>
+          </w:p>
+        </w:tc>
+      </w:tr>
+      <w:tr>
+        <w:tc>
+          <w:tcPr>
+            <w:cnfStyle w:val="001000000000" w:firstRow="0" w:lastRow="0" w:firstColumn="1" w:lastColumn="0" w:oddVBand="0" w:evenVBand="0" w:oddHBand="0" w:evenHBand="0" w:firstRowFirstColumn="0" w:firstRowLastColumn="0" w:lastRowFirstColumn="0" w:lastRowLastColumn="0"/>
+            <w:tcW w:w="747" w:type="dxa"/>
+          </w:tcPr>
+          <w:p>
+            <w:pPr>
+              <w:rPr>
+                <w:lang w:val="vi-VN"/>
+              </w:rPr>
+            </w:pPr>
+            <w:r>
+              <w:rPr>
+                <w:lang w:val="vi-VN"/>
+              </w:rPr>
+              <w:t>6</w:t>
+            </w:r>
+          </w:p>
+        </w:tc>
+        <w:tc>
+          <w:tcPr>
+            <w:tcW w:w="1891" w:type="dxa"/>
+          </w:tcPr>
+          <w:p>
+            <w:pPr>
+              <w:cnfStyle w:val="000000000000" w:firstRow="0" w:lastRow="0" w:firstColumn="0" w:lastColumn="0" w:oddVBand="0" w:evenVBand="0" w:oddHBand="0" w:evenHBand="0" w:firstRowFirstColumn="0" w:firstRowLastColumn="0" w:lastRowFirstColumn="0" w:lastRowLastColumn="0"/>
+              <w:rPr>
+                <w:lang w:val="vi-VN"/>
+              </w:rPr>
+            </w:pPr>
+            <w:r>
+              <w:rPr>
+                <w:lang w:val="vi-VN"/>
+              </w:rPr>
+              <w:t>Status</w:t>
+            </w:r>
+          </w:p>
+        </w:tc>
+        <w:tc>
+          <w:tcPr>
+            <w:tcW w:w="1504" w:type="dxa"/>
+          </w:tcPr>
+          <w:p>
+            <w:pPr>
+              <w:cnfStyle w:val="000000000000" w:firstRow="0" w:lastRow="0" w:firstColumn="0" w:lastColumn="0" w:oddVBand="0" w:evenVBand="0" w:oddHBand="0" w:evenHBand="0" w:firstRowFirstColumn="0" w:firstRowLastColumn="0" w:lastRowFirstColumn="0" w:lastRowLastColumn="0"/>
+              <w:rPr>
+                <w:lang w:val="vi-VN"/>
+              </w:rPr>
+            </w:pPr>
+            <w:r>
+              <w:rPr>
+                <w:lang w:val="vi-VN"/>
+              </w:rPr>
+              <w:t>Trạng thái nhân viên</w:t>
+            </w:r>
+          </w:p>
+        </w:tc>
+        <w:tc>
+          <w:tcPr>
+            <w:tcW w:w="2051" w:type="dxa"/>
+          </w:tcPr>
+          <w:p>
+            <w:pPr>
+              <w:cnfStyle w:val="000000000000" w:firstRow="0" w:lastRow="0" w:firstColumn="0" w:lastColumn="0" w:oddVBand="0" w:evenVBand="0" w:oddHBand="0" w:evenHBand="0" w:firstRowFirstColumn="0" w:firstRowLastColumn="0" w:lastRowFirstColumn="0" w:lastRowLastColumn="0"/>
+              <w:rPr>
+                <w:lang w:val="vi-VN"/>
+              </w:rPr>
+            </w:pPr>
+            <w:r>
+              <w:rPr>
+                <w:lang w:val="vi-VN"/>
+              </w:rPr>
+              <w:t>VARCHAR(20)</w:t>
+            </w:r>
+          </w:p>
+        </w:tc>
+        <w:tc>
+          <w:tcPr>
+            <w:tcW w:w="2585" w:type="dxa"/>
+          </w:tcPr>
+          <w:p>
+            <w:pPr>
+              <w:cnfStyle w:val="000000000000" w:firstRow="0" w:lastRow="0" w:firstColumn="0" w:lastColumn="0" w:oddVBand="0" w:evenVBand="0" w:oddHBand="0" w:evenHBand="0" w:firstRowFirstColumn="0" w:firstRowLastColumn="0" w:lastRowFirstColumn="0" w:lastRowLastColumn="0"/>
+              <w:rPr>
+                <w:lang w:val="vi-VN"/>
+              </w:rPr>
+            </w:pPr>
+            <w:r>
+              <w:rPr>
+                <w:lang w:val="vi-VN"/>
+              </w:rPr>
+              <w:t>Not null</w:t>
+            </w:r>
+          </w:p>
+        </w:tc>
+      </w:tr>
+    </w:tbl>
+    <w:p>
+      <w:pPr>
+        <w:rPr>
+          <w:lang w:val="vi-VN"/>
+        </w:rPr>
+      </w:pPr>
+    </w:p>
+    <w:p>
+      <w:pPr>
+        <w:rPr>
+          <w:lang w:val="vi-VN"/>
+        </w:rPr>
+      </w:pPr>
+      <w:r>
+        <w:rPr>
+          <w:lang w:val="vi-VN"/>
+        </w:rPr>
+        <w:t>Thực thể Warehouse</w:t>
+      </w:r>
+    </w:p>
+    <w:p>
+      <w:pPr>
+        <w:rPr>
+          <w:lang w:val="vi-VN"/>
+        </w:rPr>
+      </w:pPr>
+      <w:r>
+        <w:t>Lưu thông tin các kho chứa sản phẩm.</w:t>
+      </w:r>
+    </w:p>
+    <w:tbl>
+      <w:tblPr>
+        <w:tblStyle w:val="myTable"/>
+        <w:tblW w:w="0" w:type="auto"/>
+        <w:tblLook w:val="04A0" w:firstRow="1" w:lastRow="0" w:firstColumn="1" w:lastColumn="0" w:noHBand="0" w:noVBand="1"/>
+      </w:tblPr>
+      <w:tblGrid>
+        <w:gridCol w:w="741"/>
+        <w:gridCol w:w="2007"/>
+        <w:gridCol w:w="1394"/>
+        <w:gridCol w:w="2051"/>
+        <w:gridCol w:w="2585"/>
+      </w:tblGrid>
+      <w:tr>
+        <w:trPr>
+          <w:cnfStyle w:val="100000000000" w:firstRow="1" w:lastRow="0" w:firstColumn="0" w:lastColumn="0" w:oddVBand="0" w:evenVBand="0" w:oddHBand="0" w:evenHBand="0" w:firstRowFirstColumn="0" w:firstRowLastColumn="0" w:lastRowFirstColumn="0" w:lastRowLastColumn="0"/>
+        </w:trPr>
+        <w:tc>
+          <w:tcPr>
+            <w:cnfStyle w:val="001000000000" w:firstRow="0" w:lastRow="0" w:firstColumn="1" w:lastColumn="0" w:oddVBand="0" w:evenVBand="0" w:oddHBand="0" w:evenHBand="0" w:firstRowFirstColumn="0" w:firstRowLastColumn="0" w:lastRowFirstColumn="0" w:lastRowLastColumn="0"/>
+            <w:tcW w:w="741" w:type="dxa"/>
+          </w:tcPr>
+          <w:p>
+            <w:pPr>
+              <w:rPr>
+                <w:lang w:val="vi-VN"/>
+              </w:rPr>
+            </w:pPr>
+            <w:r>
+              <w:rPr>
+                <w:lang w:val="vi-VN"/>
+              </w:rPr>
+              <w:t>STT</w:t>
+            </w:r>
+          </w:p>
+        </w:tc>
+        <w:tc>
+          <w:tcPr>
+            <w:tcW w:w="2007" w:type="dxa"/>
+          </w:tcPr>
+          <w:p>
+            <w:pPr>
+              <w:cnfStyle w:val="100000000000" w:firstRow="1" w:lastRow="0" w:firstColumn="0" w:lastColumn="0" w:oddVBand="0" w:evenVBand="0" w:oddHBand="0" w:evenHBand="0" w:firstRowFirstColumn="0" w:firstRowLastColumn="0" w:lastRowFirstColumn="0" w:lastRowLastColumn="0"/>
+              <w:rPr>
+                <w:lang w:val="vi-VN"/>
+              </w:rPr>
+            </w:pPr>
+            <w:r>
+              <w:rPr>
+                <w:lang w:val="vi-VN"/>
+              </w:rPr>
+              <w:t>Thuộc tính</w:t>
+            </w:r>
+          </w:p>
+        </w:tc>
+        <w:tc>
+          <w:tcPr>
+            <w:tcW w:w="1394" w:type="dxa"/>
+          </w:tcPr>
+          <w:p>
+            <w:pPr>
+              <w:cnfStyle w:val="100000000000" w:firstRow="1" w:lastRow="0" w:firstColumn="0" w:lastColumn="0" w:oddVBand="0" w:evenVBand="0" w:oddHBand="0" w:evenHBand="0" w:firstRowFirstColumn="0" w:firstRowLastColumn="0" w:lastRowFirstColumn="0" w:lastRowLastColumn="0"/>
+              <w:rPr>
+                <w:lang w:val="vi-VN"/>
+              </w:rPr>
+            </w:pPr>
+            <w:r>
+              <w:rPr>
+                <w:lang w:val="vi-VN"/>
+              </w:rPr>
+              <w:t>Diễn giải</w:t>
+            </w:r>
+          </w:p>
+        </w:tc>
+        <w:tc>
+          <w:tcPr>
+            <w:tcW w:w="2051" w:type="dxa"/>
+          </w:tcPr>
+          <w:p>
+            <w:pPr>
+              <w:cnfStyle w:val="100000000000" w:firstRow="1" w:lastRow="0" w:firstColumn="0" w:lastColumn="0" w:oddVBand="0" w:evenVBand="0" w:oddHBand="0" w:evenHBand="0" w:firstRowFirstColumn="0" w:firstRowLastColumn="0" w:lastRowFirstColumn="0" w:lastRowLastColumn="0"/>
+              <w:rPr>
+                <w:lang w:val="vi-VN"/>
+              </w:rPr>
+            </w:pPr>
+            <w:r>
+              <w:rPr>
+                <w:lang w:val="vi-VN"/>
+              </w:rPr>
+              <w:t>Kiểu dữ liệu</w:t>
+            </w:r>
+          </w:p>
+        </w:tc>
+        <w:tc>
+          <w:tcPr>
+            <w:tcW w:w="2585" w:type="dxa"/>
+          </w:tcPr>
+          <w:p>
+            <w:pPr>
+              <w:cnfStyle w:val="100000000000" w:firstRow="1" w:lastRow="0" w:firstColumn="0" w:lastColumn="0" w:oddVBand="0" w:evenVBand="0" w:oddHBand="0" w:evenHBand="0" w:firstRowFirstColumn="0" w:firstRowLastColumn="0" w:lastRowFirstColumn="0" w:lastRowLastColumn="0"/>
+              <w:rPr>
+                <w:lang w:val="vi-VN"/>
+              </w:rPr>
+            </w:pPr>
+            <w:r>
+              <w:rPr>
+                <w:lang w:val="vi-VN"/>
+              </w:rPr>
+              <w:t>Ràng buộc</w:t>
+            </w:r>
+          </w:p>
+        </w:tc>
+      </w:tr>
+      <w:tr>
+        <w:tc>
+          <w:tcPr>
+            <w:cnfStyle w:val="001000000000" w:firstRow="0" w:lastRow="0" w:firstColumn="1" w:lastColumn="0" w:oddVBand="0" w:evenVBand="0" w:oddHBand="0" w:evenHBand="0" w:firstRowFirstColumn="0" w:firstRowLastColumn="0" w:lastRowFirstColumn="0" w:lastRowLastColumn="0"/>
+            <w:tcW w:w="741" w:type="dxa"/>
+          </w:tcPr>
+          <w:p>
+            <w:pPr>
+              <w:rPr>
+                <w:lang w:val="vi-VN"/>
+              </w:rPr>
+            </w:pPr>
+            <w:r>
+              <w:rPr>
+                <w:lang w:val="vi-VN"/>
+              </w:rPr>
+              <w:t>1</w:t>
+            </w:r>
+          </w:p>
+        </w:tc>
+        <w:tc>
+          <w:tcPr>
+            <w:tcW w:w="2007" w:type="dxa"/>
+          </w:tcPr>
+          <w:p>
+            <w:pPr>
+              <w:cnfStyle w:val="000000000000" w:firstRow="0" w:lastRow="0" w:firstColumn="0" w:lastColumn="0" w:oddVBand="0" w:evenVBand="0" w:oddHBand="0" w:evenHBand="0" w:firstRowFirstColumn="0" w:firstRowLastColumn="0" w:lastRowFirstColumn="0" w:lastRowLastColumn="0"/>
+              <w:rPr>
+                <w:lang w:val="vi-VN"/>
+              </w:rPr>
+            </w:pPr>
+            <w:r>
+              <w:rPr>
+                <w:lang w:val="vi-VN"/>
+              </w:rPr>
+              <w:t>Warehouse</w:t>
+            </w:r>
+            <w:r>
+              <w:rPr>
+                <w:lang w:val="vi-VN"/>
+              </w:rPr>
+              <w:t>Id</w:t>
+            </w:r>
+          </w:p>
+        </w:tc>
+        <w:tc>
+          <w:tcPr>
+            <w:tcW w:w="1394" w:type="dxa"/>
+          </w:tcPr>
+          <w:p>
+            <w:pPr>
+              <w:cnfStyle w:val="000000000000" w:firstRow="0" w:lastRow="0" w:firstColumn="0" w:lastColumn="0" w:oddVBand="0" w:evenVBand="0" w:oddHBand="0" w:evenHBand="0" w:firstRowFirstColumn="0" w:firstRowLastColumn="0" w:lastRowFirstColumn="0" w:lastRowLastColumn="0"/>
+              <w:rPr>
+                <w:lang w:val="vi-VN"/>
+              </w:rPr>
+            </w:pPr>
+            <w:r>
+              <w:rPr>
+                <w:lang w:val="vi-VN"/>
+              </w:rPr>
+              <w:t xml:space="preserve">Mã </w:t>
+            </w:r>
+            <w:r>
+              <w:rPr>
+                <w:lang w:val="vi-VN"/>
+              </w:rPr>
+              <w:t>kho</w:t>
+            </w:r>
+          </w:p>
+        </w:tc>
+        <w:tc>
+          <w:tcPr>
+            <w:tcW w:w="2051" w:type="dxa"/>
+          </w:tcPr>
+          <w:p>
+            <w:pPr>
+              <w:cnfStyle w:val="000000000000" w:firstRow="0" w:lastRow="0" w:firstColumn="0" w:lastColumn="0" w:oddVBand="0" w:evenVBand="0" w:oddHBand="0" w:evenHBand="0" w:firstRowFirstColumn="0" w:firstRowLastColumn="0" w:lastRowFirstColumn="0" w:lastRowLastColumn="0"/>
+              <w:rPr>
+                <w:lang w:val="vi-VN"/>
+              </w:rPr>
+            </w:pPr>
+            <w:r>
+              <w:rPr>
+                <w:lang w:val="vi-VN"/>
+              </w:rPr>
+              <w:t>INT</w:t>
+            </w:r>
+          </w:p>
+        </w:tc>
+        <w:tc>
+          <w:tcPr>
+            <w:tcW w:w="2585" w:type="dxa"/>
+          </w:tcPr>
+          <w:p>
+            <w:pPr>
+              <w:cnfStyle w:val="000000000000" w:firstRow="0" w:lastRow="0" w:firstColumn="0" w:lastColumn="0" w:oddVBand="0" w:evenVBand="0" w:oddHBand="0" w:evenHBand="0" w:firstRowFirstColumn="0" w:firstRowLastColumn="0" w:lastRowFirstColumn="0" w:lastRowLastColumn="0"/>
+              <w:rPr>
+                <w:lang w:val="vi-VN"/>
+              </w:rPr>
+            </w:pPr>
+            <w:r>
+              <w:rPr>
+                <w:lang w:val="vi-VN"/>
+              </w:rPr>
+              <w:t>PK, AUTO_INCREMENT</w:t>
+            </w:r>
+          </w:p>
+        </w:tc>
+      </w:tr>
+      <w:tr>
+        <w:tc>
+          <w:tcPr>
+            <w:cnfStyle w:val="001000000000" w:firstRow="0" w:lastRow="0" w:firstColumn="1" w:lastColumn="0" w:oddVBand="0" w:evenVBand="0" w:oddHBand="0" w:evenHBand="0" w:firstRowFirstColumn="0" w:firstRowLastColumn="0" w:lastRowFirstColumn="0" w:lastRowLastColumn="0"/>
+            <w:tcW w:w="741" w:type="dxa"/>
+          </w:tcPr>
+          <w:p>
+            <w:pPr>
+              <w:rPr>
+                <w:lang w:val="vi-VN"/>
+              </w:rPr>
+            </w:pPr>
+            <w:r>
+              <w:rPr>
+                <w:lang w:val="vi-VN"/>
+              </w:rPr>
+              <w:t>2</w:t>
+            </w:r>
+          </w:p>
+        </w:tc>
+        <w:tc>
+          <w:tcPr>
+            <w:tcW w:w="2007" w:type="dxa"/>
+          </w:tcPr>
+          <w:p>
+            <w:pPr>
+              <w:cnfStyle w:val="000000000000" w:firstRow="0" w:lastRow="0" w:firstColumn="0" w:lastColumn="0" w:oddVBand="0" w:evenVBand="0" w:oddHBand="0" w:evenHBand="0" w:firstRowFirstColumn="0" w:firstRowLastColumn="0" w:lastRowFirstColumn="0" w:lastRowLastColumn="0"/>
+              <w:rPr>
+                <w:lang w:val="vi-VN"/>
+              </w:rPr>
+            </w:pPr>
+            <w:r>
+              <w:rPr>
+                <w:lang w:val="vi-VN"/>
+              </w:rPr>
+              <w:t>Warehouse</w:t>
+            </w:r>
+            <w:r>
+              <w:rPr>
+                <w:lang w:val="vi-VN"/>
+              </w:rPr>
+              <w:t>Name</w:t>
+            </w:r>
+          </w:p>
+        </w:tc>
+        <w:tc>
+          <w:tcPr>
+            <w:tcW w:w="1394" w:type="dxa"/>
+          </w:tcPr>
+          <w:p>
+            <w:pPr>
+              <w:cnfStyle w:val="000000000000" w:firstRow="0" w:lastRow="0" w:firstColumn="0" w:lastColumn="0" w:oddVBand="0" w:evenVBand="0" w:oddHBand="0" w:evenHBand="0" w:firstRowFirstColumn="0" w:firstRowLastColumn="0" w:lastRowFirstColumn="0" w:lastRowLastColumn="0"/>
+              <w:rPr>
+                <w:lang w:val="vi-VN"/>
+              </w:rPr>
+            </w:pPr>
+            <w:r>
+              <w:rPr>
+                <w:lang w:val="vi-VN"/>
+              </w:rPr>
+              <w:t xml:space="preserve">Tên </w:t>
+            </w:r>
+            <w:r>
+              <w:rPr>
+                <w:lang w:val="vi-VN"/>
+              </w:rPr>
+              <w:t>kho</w:t>
+            </w:r>
+          </w:p>
+        </w:tc>
+        <w:tc>
+          <w:tcPr>
+            <w:tcW w:w="2051" w:type="dxa"/>
+          </w:tcPr>
+          <w:p>
+            <w:pPr>
+              <w:cnfStyle w:val="000000000000" w:firstRow="0" w:lastRow="0" w:firstColumn="0" w:lastColumn="0" w:oddVBand="0" w:evenVBand="0" w:oddHBand="0" w:evenHBand="0" w:firstRowFirstColumn="0" w:firstRowLastColumn="0" w:lastRowFirstColumn="0" w:lastRowLastColumn="0"/>
+              <w:rPr>
+                <w:lang w:val="vi-VN"/>
+              </w:rPr>
+            </w:pPr>
+            <w:r>
+              <w:rPr>
+                <w:lang w:val="vi-VN"/>
+              </w:rPr>
+              <w:t>VARCHAR(150)</w:t>
+            </w:r>
+          </w:p>
+        </w:tc>
+        <w:tc>
+          <w:tcPr>
+            <w:tcW w:w="2585" w:type="dxa"/>
+          </w:tcPr>
+          <w:p>
+            <w:pPr>
+              <w:cnfStyle w:val="000000000000" w:firstRow="0" w:lastRow="0" w:firstColumn="0" w:lastColumn="0" w:oddVBand="0" w:evenVBand="0" w:oddHBand="0" w:evenHBand="0" w:firstRowFirstColumn="0" w:firstRowLastColumn="0" w:lastRowFirstColumn="0" w:lastRowLastColumn="0"/>
+              <w:rPr>
+                <w:lang w:val="vi-VN"/>
+              </w:rPr>
+            </w:pPr>
+            <w:r>
+              <w:rPr>
+                <w:lang w:val="vi-VN"/>
+              </w:rPr>
+              <w:t>Not null</w:t>
+            </w:r>
+          </w:p>
+        </w:tc>
+      </w:tr>
+      <w:tr>
+        <w:tc>
+          <w:tcPr>
+            <w:cnfStyle w:val="001000000000" w:firstRow="0" w:lastRow="0" w:firstColumn="1" w:lastColumn="0" w:oddVBand="0" w:evenVBand="0" w:oddHBand="0" w:evenHBand="0" w:firstRowFirstColumn="0" w:firstRowLastColumn="0" w:lastRowFirstColumn="0" w:lastRowLastColumn="0"/>
+            <w:tcW w:w="741" w:type="dxa"/>
+          </w:tcPr>
+          <w:p>
+            <w:pPr>
+              <w:rPr>
+                <w:lang w:val="vi-VN"/>
+              </w:rPr>
+            </w:pPr>
+            <w:r>
+              <w:rPr>
+                <w:lang w:val="vi-VN"/>
+              </w:rPr>
+              <w:t>3</w:t>
+            </w:r>
+          </w:p>
+        </w:tc>
+        <w:tc>
+          <w:tcPr>
+            <w:tcW w:w="2007" w:type="dxa"/>
+          </w:tcPr>
+          <w:p>
+            <w:pPr>
+              <w:cnfStyle w:val="000000000000" w:firstRow="0" w:lastRow="0" w:firstColumn="0" w:lastColumn="0" w:oddVBand="0" w:evenVBand="0" w:oddHBand="0" w:evenHBand="0" w:firstRowFirstColumn="0" w:firstRowLastColumn="0" w:lastRowFirstColumn="0" w:lastRowLastColumn="0"/>
+              <w:rPr>
+                <w:lang w:val="vi-VN"/>
+              </w:rPr>
+            </w:pPr>
+            <w:r>
+              <w:rPr>
+                <w:lang w:val="vi-VN"/>
+              </w:rPr>
+              <w:t>Address</w:t>
+            </w:r>
+          </w:p>
+        </w:tc>
+        <w:tc>
+          <w:tcPr>
+            <w:tcW w:w="1394" w:type="dxa"/>
+          </w:tcPr>
+          <w:p>
+            <w:pPr>
+              <w:cnfStyle w:val="000000000000" w:firstRow="0" w:lastRow="0" w:firstColumn="0" w:lastColumn="0" w:oddVBand="0" w:evenVBand="0" w:oddHBand="0" w:evenHBand="0" w:firstRowFirstColumn="0" w:firstRowLastColumn="0" w:lastRowFirstColumn="0" w:lastRowLastColumn="0"/>
+              <w:rPr>
+                <w:lang w:val="vi-VN"/>
+              </w:rPr>
+            </w:pPr>
+            <w:r>
+              <w:rPr>
+                <w:lang w:val="vi-VN"/>
+              </w:rPr>
+              <w:t>Địa chỉ kho</w:t>
+            </w:r>
+          </w:p>
+        </w:tc>
+        <w:tc>
+          <w:tcPr>
+            <w:tcW w:w="2051" w:type="dxa"/>
+          </w:tcPr>
+          <w:p>
+            <w:pPr>
+              <w:cnfStyle w:val="000000000000" w:firstRow="0" w:lastRow="0" w:firstColumn="0" w:lastColumn="0" w:oddVBand="0" w:evenVBand="0" w:oddHBand="0" w:evenHBand="0" w:firstRowFirstColumn="0" w:firstRowLastColumn="0" w:lastRowFirstColumn="0" w:lastRowLastColumn="0"/>
+              <w:rPr>
+                <w:lang w:val="vi-VN"/>
+              </w:rPr>
+            </w:pPr>
+            <w:r>
+              <w:rPr>
+                <w:lang w:val="vi-VN"/>
+              </w:rPr>
+              <w:t>VARCHAR(20)</w:t>
+            </w:r>
+          </w:p>
+        </w:tc>
+        <w:tc>
+          <w:tcPr>
+            <w:tcW w:w="2585" w:type="dxa"/>
+          </w:tcPr>
+          <w:p>
+            <w:pPr>
+              <w:cnfStyle w:val="000000000000" w:firstRow="0" w:lastRow="0" w:firstColumn="0" w:lastColumn="0" w:oddVBand="0" w:evenVBand="0" w:oddHBand="0" w:evenHBand="0" w:firstRowFirstColumn="0" w:firstRowLastColumn="0" w:lastRowFirstColumn="0" w:lastRowLastColumn="0"/>
+              <w:rPr>
+                <w:lang w:val="vi-VN"/>
+              </w:rPr>
+            </w:pPr>
+            <w:r>
+              <w:rPr>
+                <w:lang w:val="vi-VN"/>
+              </w:rPr>
+              <w:t>Not null</w:t>
+            </w:r>
+          </w:p>
+        </w:tc>
+      </w:tr>
+      <w:tr>
+        <w:tc>
+          <w:tcPr>
+            <w:cnfStyle w:val="001000000000" w:firstRow="0" w:lastRow="0" w:firstColumn="1" w:lastColumn="0" w:oddVBand="0" w:evenVBand="0" w:oddHBand="0" w:evenHBand="0" w:firstRowFirstColumn="0" w:firstRowLastColumn="0" w:lastRowFirstColumn="0" w:lastRowLastColumn="0"/>
+            <w:tcW w:w="741" w:type="dxa"/>
+          </w:tcPr>
+          <w:p>
+            <w:pPr>
+              <w:rPr>
+                <w:lang w:val="vi-VN"/>
+              </w:rPr>
+            </w:pPr>
+            <w:r>
+              <w:rPr>
+                <w:lang w:val="vi-VN"/>
+              </w:rPr>
+              <w:t>4</w:t>
+            </w:r>
+          </w:p>
+        </w:tc>
+        <w:tc>
+          <w:tcPr>
+            <w:tcW w:w="2007" w:type="dxa"/>
+          </w:tcPr>
+          <w:p>
+            <w:pPr>
+              <w:cnfStyle w:val="000000000000" w:firstRow="0" w:lastRow="0" w:firstColumn="0" w:lastColumn="0" w:oddVBand="0" w:evenVBand="0" w:oddHBand="0" w:evenHBand="0" w:firstRowFirstColumn="0" w:firstRowLastColumn="0" w:lastRowFirstColumn="0" w:lastRowLastColumn="0"/>
+              <w:rPr>
+                <w:lang w:val="vi-VN"/>
+              </w:rPr>
+            </w:pPr>
+            <w:r>
+              <w:rPr>
+                <w:lang w:val="vi-VN"/>
+              </w:rPr>
+              <w:t>Description</w:t>
+            </w:r>
+          </w:p>
+        </w:tc>
+        <w:tc>
+          <w:tcPr>
+            <w:tcW w:w="1394" w:type="dxa"/>
+          </w:tcPr>
+          <w:p>
+            <w:pPr>
+              <w:cnfStyle w:val="000000000000" w:firstRow="0" w:lastRow="0" w:firstColumn="0" w:lastColumn="0" w:oddVBand="0" w:evenVBand="0" w:oddHBand="0" w:evenHBand="0" w:firstRowFirstColumn="0" w:firstRowLastColumn="0" w:lastRowFirstColumn="0" w:lastRowLastColumn="0"/>
+              <w:rPr>
+                <w:lang w:val="vi-VN"/>
+              </w:rPr>
+            </w:pPr>
+            <w:r>
+              <w:rPr>
+                <w:lang w:val="vi-VN"/>
+              </w:rPr>
+              <w:t>Mô tả</w:t>
+            </w:r>
+          </w:p>
+        </w:tc>
+        <w:tc>
+          <w:tcPr>
+            <w:tcW w:w="2051" w:type="dxa"/>
+          </w:tcPr>
+          <w:p>
+            <w:pPr>
+              <w:cnfStyle w:val="000000000000" w:firstRow="0" w:lastRow="0" w:firstColumn="0" w:lastColumn="0" w:oddVBand="0" w:evenVBand="0" w:oddHBand="0" w:evenHBand="0" w:firstRowFirstColumn="0" w:firstRowLastColumn="0" w:lastRowFirstColumn="0" w:lastRowLastColumn="0"/>
+              <w:rPr>
+                <w:lang w:val="vi-VN"/>
+              </w:rPr>
+            </w:pPr>
+            <w:r>
+              <w:rPr>
+                <w:lang w:val="vi-VN"/>
+              </w:rPr>
+              <w:t>VARCHAR(100)</w:t>
+            </w:r>
+          </w:p>
+        </w:tc>
+        <w:tc>
+          <w:tcPr>
+            <w:tcW w:w="2585" w:type="dxa"/>
+          </w:tcPr>
+          <w:p>
+            <w:pPr>
+              <w:cnfStyle w:val="000000000000" w:firstRow="0" w:lastRow="0" w:firstColumn="0" w:lastColumn="0" w:oddVBand="0" w:evenVBand="0" w:oddHBand="0" w:evenHBand="0" w:firstRowFirstColumn="0" w:firstRowLastColumn="0" w:lastRowFirstColumn="0" w:lastRowLastColumn="0"/>
+              <w:rPr>
+                <w:lang w:val="vi-VN"/>
+              </w:rPr>
+            </w:pPr>
+          </w:p>
+        </w:tc>
+      </w:tr>
+      <w:tr>
+        <w:tc>
+          <w:tcPr>
+            <w:cnfStyle w:val="001000000000" w:firstRow="0" w:lastRow="0" w:firstColumn="1" w:lastColumn="0" w:oddVBand="0" w:evenVBand="0" w:oddHBand="0" w:evenHBand="0" w:firstRowFirstColumn="0" w:firstRowLastColumn="0" w:lastRowFirstColumn="0" w:lastRowLastColumn="0"/>
+            <w:tcW w:w="741" w:type="dxa"/>
+          </w:tcPr>
+          <w:p>
+            <w:pPr>
+              <w:rPr>
+                <w:lang w:val="vi-VN"/>
+              </w:rPr>
+            </w:pPr>
+            <w:r>
+              <w:rPr>
+                <w:lang w:val="vi-VN"/>
+              </w:rPr>
+              <w:t>5</w:t>
+            </w:r>
+          </w:p>
+        </w:tc>
+        <w:tc>
+          <w:tcPr>
+            <w:tcW w:w="2007" w:type="dxa"/>
+          </w:tcPr>
+          <w:p>
+            <w:pPr>
+              <w:cnfStyle w:val="000000000000" w:firstRow="0" w:lastRow="0" w:firstColumn="0" w:lastColumn="0" w:oddVBand="0" w:evenVBand="0" w:oddHBand="0" w:evenHBand="0" w:firstRowFirstColumn="0" w:firstRowLastColumn="0" w:lastRowFirstColumn="0" w:lastRowLastColumn="0"/>
+              <w:rPr>
+                <w:lang w:val="vi-VN"/>
+              </w:rPr>
+            </w:pPr>
+            <w:r>
+              <w:rPr>
+                <w:lang w:val="vi-VN"/>
+              </w:rPr>
+              <w:t>Status</w:t>
+            </w:r>
+          </w:p>
+        </w:tc>
+        <w:tc>
+          <w:tcPr>
+            <w:tcW w:w="1394" w:type="dxa"/>
+          </w:tcPr>
+          <w:p>
+            <w:pPr>
+              <w:cnfStyle w:val="000000000000" w:firstRow="0" w:lastRow="0" w:firstColumn="0" w:lastColumn="0" w:oddVBand="0" w:evenVBand="0" w:oddHBand="0" w:evenHBand="0" w:firstRowFirstColumn="0" w:firstRowLastColumn="0" w:lastRowFirstColumn="0" w:lastRowLastColumn="0"/>
+              <w:rPr>
+                <w:lang w:val="vi-VN"/>
+              </w:rPr>
+            </w:pPr>
+            <w:r>
+              <w:rPr>
+                <w:lang w:val="vi-VN"/>
+              </w:rPr>
+              <w:t>Trạng thái nhân viên</w:t>
+            </w:r>
+          </w:p>
+        </w:tc>
+        <w:tc>
+          <w:tcPr>
+            <w:tcW w:w="2051" w:type="dxa"/>
+          </w:tcPr>
+          <w:p>
+            <w:pPr>
+              <w:cnfStyle w:val="000000000000" w:firstRow="0" w:lastRow="0" w:firstColumn="0" w:lastColumn="0" w:oddVBand="0" w:evenVBand="0" w:oddHBand="0" w:evenHBand="0" w:firstRowFirstColumn="0" w:firstRowLastColumn="0" w:lastRowFirstColumn="0" w:lastRowLastColumn="0"/>
+              <w:rPr>
+                <w:lang w:val="vi-VN"/>
+              </w:rPr>
+            </w:pPr>
+            <w:r>
+              <w:rPr>
+                <w:lang w:val="vi-VN"/>
+              </w:rPr>
+              <w:t>VARCHAR(20)</w:t>
+            </w:r>
+          </w:p>
+        </w:tc>
+        <w:tc>
+          <w:tcPr>
+            <w:tcW w:w="2585" w:type="dxa"/>
+          </w:tcPr>
+          <w:p>
+            <w:pPr>
+              <w:cnfStyle w:val="000000000000" w:firstRow="0" w:lastRow="0" w:firstColumn="0" w:lastColumn="0" w:oddVBand="0" w:evenVBand="0" w:oddHBand="0" w:evenHBand="0" w:firstRowFirstColumn="0" w:firstRowLastColumn="0" w:lastRowFirstColumn="0" w:lastRowLastColumn="0"/>
+              <w:rPr>
+                <w:lang w:val="vi-VN"/>
+              </w:rPr>
+            </w:pPr>
+            <w:r>
+              <w:rPr>
+                <w:lang w:val="vi-VN"/>
+              </w:rPr>
+              <w:t>Not null</w:t>
+            </w:r>
+          </w:p>
+        </w:tc>
+      </w:tr>
+    </w:tbl>
+    <w:p>
+      <w:pPr>
+        <w:rPr>
+          <w:lang w:val="vi-VN"/>
+        </w:rPr>
+      </w:pPr>
+    </w:p>
+    <w:p>
+      <w:pPr>
+        <w:rPr>
+          <w:lang w:val="vi-VN"/>
+        </w:rPr>
+      </w:pPr>
+      <w:r>
+        <w:rPr>
+          <w:lang w:val="vi-VN"/>
+        </w:rPr>
+        <w:t xml:space="preserve">Thực thể </w:t>
+      </w:r>
+      <w:r>
+        <w:t>WarehouseProduct</w:t>
+      </w:r>
+    </w:p>
+    <w:p>
+      <w:r>
+        <w:t xml:space="preserve">Bảng này dùng để quản lý </w:t>
+      </w:r>
+      <w:r>
+        <w:rPr>
+          <w:b/>
+          <w:bCs/>
+        </w:rPr>
+        <w:t>số lượng sản phẩm tồn tại trong từng kho</w:t>
+      </w:r>
+      <w:r>
+        <w:t>.</w:t>
+      </w:r>
+    </w:p>
+    <w:p>
+      <w:pPr>
+        <w:rPr>
+          <w:lang w:val="vi-VN"/>
+        </w:rPr>
+      </w:pPr>
+      <w:r>
+        <w:t>Đây là bảng trung gian giữa Warehouse và Product.</w:t>
+      </w:r>
+    </w:p>
+    <w:tbl>
+      <w:tblPr>
+        <w:tblStyle w:val="myTable"/>
+        <w:tblW w:w="0" w:type="auto"/>
+        <w:tblLook w:val="04A0" w:firstRow="1" w:lastRow="0" w:firstColumn="1" w:lastColumn="0" w:noHBand="0" w:noVBand="1"/>
+      </w:tblPr>
+      <w:tblGrid>
+        <w:gridCol w:w="741"/>
+        <w:gridCol w:w="2007"/>
+        <w:gridCol w:w="1394"/>
+        <w:gridCol w:w="2051"/>
+        <w:gridCol w:w="2585"/>
+      </w:tblGrid>
+      <w:tr>
+        <w:trPr>
+          <w:cnfStyle w:val="100000000000" w:firstRow="1" w:lastRow="0" w:firstColumn="0" w:lastColumn="0" w:oddVBand="0" w:evenVBand="0" w:oddHBand="0" w:evenHBand="0" w:firstRowFirstColumn="0" w:firstRowLastColumn="0" w:lastRowFirstColumn="0" w:lastRowLastColumn="0"/>
+        </w:trPr>
+        <w:tc>
+          <w:tcPr>
+            <w:cnfStyle w:val="001000000000" w:firstRow="0" w:lastRow="0" w:firstColumn="1" w:lastColumn="0" w:oddVBand="0" w:evenVBand="0" w:oddHBand="0" w:evenHBand="0" w:firstRowFirstColumn="0" w:firstRowLastColumn="0" w:lastRowFirstColumn="0" w:lastRowLastColumn="0"/>
+            <w:tcW w:w="741" w:type="dxa"/>
+          </w:tcPr>
+          <w:p>
+            <w:pPr>
+              <w:rPr>
+                <w:lang w:val="vi-VN"/>
+              </w:rPr>
+            </w:pPr>
+            <w:r>
+              <w:rPr>
+                <w:lang w:val="vi-VN"/>
+              </w:rPr>
+              <w:t>STT</w:t>
+            </w:r>
+          </w:p>
+        </w:tc>
+        <w:tc>
+          <w:tcPr>
+            <w:tcW w:w="2007" w:type="dxa"/>
+          </w:tcPr>
+          <w:p>
+            <w:pPr>
+              <w:cnfStyle w:val="100000000000" w:firstRow="1" w:lastRow="0" w:firstColumn="0" w:lastColumn="0" w:oddVBand="0" w:evenVBand="0" w:oddHBand="0" w:evenHBand="0" w:firstRowFirstColumn="0" w:firstRowLastColumn="0" w:lastRowFirstColumn="0" w:lastRowLastColumn="0"/>
+              <w:rPr>
+                <w:lang w:val="vi-VN"/>
+              </w:rPr>
+            </w:pPr>
+            <w:r>
+              <w:rPr>
+                <w:lang w:val="vi-VN"/>
+              </w:rPr>
+              <w:t>Thuộc tính</w:t>
+            </w:r>
+          </w:p>
+        </w:tc>
+        <w:tc>
+          <w:tcPr>
+            <w:tcW w:w="1394" w:type="dxa"/>
+          </w:tcPr>
+          <w:p>
+            <w:pPr>
+              <w:cnfStyle w:val="100000000000" w:firstRow="1" w:lastRow="0" w:firstColumn="0" w:lastColumn="0" w:oddVBand="0" w:evenVBand="0" w:oddHBand="0" w:evenHBand="0" w:firstRowFirstColumn="0" w:firstRowLastColumn="0" w:lastRowFirstColumn="0" w:lastRowLastColumn="0"/>
+              <w:rPr>
+                <w:lang w:val="vi-VN"/>
+              </w:rPr>
+            </w:pPr>
+            <w:r>
+              <w:rPr>
+                <w:lang w:val="vi-VN"/>
+              </w:rPr>
+              <w:t>Diễn giải</w:t>
+            </w:r>
+          </w:p>
+        </w:tc>
+        <w:tc>
+          <w:tcPr>
+            <w:tcW w:w="2051" w:type="dxa"/>
+          </w:tcPr>
+          <w:p>
+            <w:pPr>
+              <w:cnfStyle w:val="100000000000" w:firstRow="1" w:lastRow="0" w:firstColumn="0" w:lastColumn="0" w:oddVBand="0" w:evenVBand="0" w:oddHBand="0" w:evenHBand="0" w:firstRowFirstColumn="0" w:firstRowLastColumn="0" w:lastRowFirstColumn="0" w:lastRowLastColumn="0"/>
+              <w:rPr>
+                <w:lang w:val="vi-VN"/>
+              </w:rPr>
+            </w:pPr>
+            <w:r>
+              <w:rPr>
+                <w:lang w:val="vi-VN"/>
+              </w:rPr>
+              <w:t>Kiểu dữ liệu</w:t>
+            </w:r>
+          </w:p>
+        </w:tc>
+        <w:tc>
+          <w:tcPr>
+            <w:tcW w:w="2585" w:type="dxa"/>
+          </w:tcPr>
+          <w:p>
+            <w:pPr>
+              <w:cnfStyle w:val="100000000000" w:firstRow="1" w:lastRow="0" w:firstColumn="0" w:lastColumn="0" w:oddVBand="0" w:evenVBand="0" w:oddHBand="0" w:evenHBand="0" w:firstRowFirstColumn="0" w:firstRowLastColumn="0" w:lastRowFirstColumn="0" w:lastRowLastColumn="0"/>
+              <w:rPr>
+                <w:lang w:val="vi-VN"/>
+              </w:rPr>
+            </w:pPr>
+            <w:r>
+              <w:rPr>
+                <w:lang w:val="vi-VN"/>
+              </w:rPr>
+              <w:t>Ràng buộc</w:t>
+            </w:r>
+          </w:p>
+        </w:tc>
+      </w:tr>
+      <w:tr>
+        <w:tc>
+          <w:tcPr>
+            <w:cnfStyle w:val="001000000000" w:firstRow="0" w:lastRow="0" w:firstColumn="1" w:lastColumn="0" w:oddVBand="0" w:evenVBand="0" w:oddHBand="0" w:evenHBand="0" w:firstRowFirstColumn="0" w:firstRowLastColumn="0" w:lastRowFirstColumn="0" w:lastRowLastColumn="0"/>
+            <w:tcW w:w="741" w:type="dxa"/>
+          </w:tcPr>
+          <w:p>
+            <w:pPr>
+              <w:rPr>
+                <w:lang w:val="vi-VN"/>
+              </w:rPr>
+            </w:pPr>
+            <w:r>
+              <w:rPr>
+                <w:lang w:val="vi-VN"/>
+              </w:rPr>
+              <w:t>1</w:t>
+            </w:r>
+          </w:p>
+        </w:tc>
+        <w:tc>
+          <w:tcPr>
+            <w:tcW w:w="2007" w:type="dxa"/>
+          </w:tcPr>
+          <w:p>
+            <w:pPr>
+              <w:cnfStyle w:val="000000000000" w:firstRow="0" w:lastRow="0" w:firstColumn="0" w:lastColumn="0" w:oddVBand="0" w:evenVBand="0" w:oddHBand="0" w:evenHBand="0" w:firstRowFirstColumn="0" w:firstRowLastColumn="0" w:lastRowFirstColumn="0" w:lastRowLastColumn="0"/>
+              <w:rPr>
+                <w:lang w:val="vi-VN"/>
+              </w:rPr>
+            </w:pPr>
+            <w:r>
+              <w:rPr>
+                <w:lang w:val="vi-VN"/>
+              </w:rPr>
+              <w:t>WarehouseId</w:t>
+            </w:r>
+          </w:p>
+        </w:tc>
+        <w:tc>
+          <w:tcPr>
+            <w:tcW w:w="1394" w:type="dxa"/>
+          </w:tcPr>
+          <w:p>
+            <w:pPr>
+              <w:cnfStyle w:val="000000000000" w:firstRow="0" w:lastRow="0" w:firstColumn="0" w:lastColumn="0" w:oddVBand="0" w:evenVBand="0" w:oddHBand="0" w:evenHBand="0" w:firstRowFirstColumn="0" w:firstRowLastColumn="0" w:lastRowFirstColumn="0" w:lastRowLastColumn="0"/>
+              <w:rPr>
+                <w:lang w:val="vi-VN"/>
+              </w:rPr>
+            </w:pPr>
+            <w:r>
+              <w:rPr>
+                <w:lang w:val="vi-VN"/>
+              </w:rPr>
+              <w:t>Mã kho</w:t>
+            </w:r>
+          </w:p>
+        </w:tc>
+        <w:tc>
+          <w:tcPr>
+            <w:tcW w:w="2051" w:type="dxa"/>
+          </w:tcPr>
+          <w:p>
+            <w:pPr>
+              <w:cnfStyle w:val="000000000000" w:firstRow="0" w:lastRow="0" w:firstColumn="0" w:lastColumn="0" w:oddVBand="0" w:evenVBand="0" w:oddHBand="0" w:evenHBand="0" w:firstRowFirstColumn="0" w:firstRowLastColumn="0" w:lastRowFirstColumn="0" w:lastRowLastColumn="0"/>
+              <w:rPr>
+                <w:lang w:val="vi-VN"/>
+              </w:rPr>
+            </w:pPr>
+            <w:r>
+              <w:rPr>
+                <w:lang w:val="vi-VN"/>
+              </w:rPr>
+              <w:t>INT</w:t>
+            </w:r>
+          </w:p>
+        </w:tc>
+        <w:tc>
+          <w:tcPr>
+            <w:tcW w:w="2585" w:type="dxa"/>
+          </w:tcPr>
+          <w:p>
+            <w:pPr>
+              <w:cnfStyle w:val="000000000000" w:firstRow="0" w:lastRow="0" w:firstColumn="0" w:lastColumn="0" w:oddVBand="0" w:evenVBand="0" w:oddHBand="0" w:evenHBand="0" w:firstRowFirstColumn="0" w:firstRowLastColumn="0" w:lastRowFirstColumn="0" w:lastRowLastColumn="0"/>
+              <w:rPr>
+                <w:lang w:val="vi-VN"/>
+              </w:rPr>
+            </w:pPr>
+            <w:r>
+              <w:rPr>
+                <w:lang w:val="vi-VN"/>
+              </w:rPr>
+              <w:t>PK, FK</w:t>
+            </w:r>
+          </w:p>
+        </w:tc>
+      </w:tr>
+      <w:tr>
+        <w:tc>
+          <w:tcPr>
+            <w:cnfStyle w:val="001000000000" w:firstRow="0" w:lastRow="0" w:firstColumn="1" w:lastColumn="0" w:oddVBand="0" w:evenVBand="0" w:oddHBand="0" w:evenHBand="0" w:firstRowFirstColumn="0" w:firstRowLastColumn="0" w:lastRowFirstColumn="0" w:lastRowLastColumn="0"/>
+            <w:tcW w:w="741" w:type="dxa"/>
+          </w:tcPr>
+          <w:p>
+            <w:pPr>
+              <w:rPr>
+                <w:lang w:val="vi-VN"/>
+              </w:rPr>
+            </w:pPr>
+            <w:r>
+              <w:rPr>
+                <w:lang w:val="vi-VN"/>
+              </w:rPr>
+              <w:t>2</w:t>
+            </w:r>
+          </w:p>
+        </w:tc>
+        <w:tc>
+          <w:tcPr>
+            <w:tcW w:w="2007" w:type="dxa"/>
+          </w:tcPr>
+          <w:p>
+            <w:pPr>
+              <w:cnfStyle w:val="000000000000" w:firstRow="0" w:lastRow="0" w:firstColumn="0" w:lastColumn="0" w:oddVBand="0" w:evenVBand="0" w:oddHBand="0" w:evenHBand="0" w:firstRowFirstColumn="0" w:firstRowLastColumn="0" w:lastRowFirstColumn="0" w:lastRowLastColumn="0"/>
+              <w:rPr>
+                <w:lang w:val="vi-VN"/>
+              </w:rPr>
+            </w:pPr>
+            <w:r>
+              <w:rPr>
+                <w:lang w:val="vi-VN"/>
+              </w:rPr>
+              <w:t>ProductId</w:t>
+            </w:r>
+          </w:p>
+        </w:tc>
+        <w:tc>
+          <w:tcPr>
+            <w:tcW w:w="1394" w:type="dxa"/>
+          </w:tcPr>
+          <w:p>
+            <w:pPr>
+              <w:cnfStyle w:val="000000000000" w:firstRow="0" w:lastRow="0" w:firstColumn="0" w:lastColumn="0" w:oddVBand="0" w:evenVBand="0" w:oddHBand="0" w:evenHBand="0" w:firstRowFirstColumn="0" w:firstRowLastColumn="0" w:lastRowFirstColumn="0" w:lastRowLastColumn="0"/>
+              <w:rPr>
+                <w:lang w:val="vi-VN"/>
+              </w:rPr>
+            </w:pPr>
+            <w:r>
+              <w:rPr>
+                <w:lang w:val="vi-VN"/>
+              </w:rPr>
+              <w:t>Mã sản phẩm</w:t>
+            </w:r>
+          </w:p>
+        </w:tc>
+        <w:tc>
+          <w:tcPr>
+            <w:tcW w:w="2051" w:type="dxa"/>
+          </w:tcPr>
+          <w:p>
+            <w:pPr>
+              <w:cnfStyle w:val="000000000000" w:firstRow="0" w:lastRow="0" w:firstColumn="0" w:lastColumn="0" w:oddVBand="0" w:evenVBand="0" w:oddHBand="0" w:evenHBand="0" w:firstRowFirstColumn="0" w:firstRowLastColumn="0" w:lastRowFirstColumn="0" w:lastRowLastColumn="0"/>
+              <w:rPr>
+                <w:lang w:val="vi-VN"/>
+              </w:rPr>
+            </w:pPr>
+            <w:r>
+              <w:rPr>
+                <w:lang w:val="vi-VN"/>
+              </w:rPr>
+              <w:t>INT</w:t>
+            </w:r>
+          </w:p>
+        </w:tc>
+        <w:tc>
+          <w:tcPr>
+            <w:tcW w:w="2585" w:type="dxa"/>
+          </w:tcPr>
+          <w:p>
+            <w:pPr>
+              <w:cnfStyle w:val="000000000000" w:firstRow="0" w:lastRow="0" w:firstColumn="0" w:lastColumn="0" w:oddVBand="0" w:evenVBand="0" w:oddHBand="0" w:evenHBand="0" w:firstRowFirstColumn="0" w:firstRowLastColumn="0" w:lastRowFirstColumn="0" w:lastRowLastColumn="0"/>
+              <w:rPr>
+                <w:lang w:val="vi-VN"/>
+              </w:rPr>
+            </w:pPr>
+            <w:r>
+              <w:rPr>
+                <w:lang w:val="vi-VN"/>
+              </w:rPr>
+              <w:t>PK, FK</w:t>
+            </w:r>
+          </w:p>
+        </w:tc>
+      </w:tr>
+      <w:tr>
+        <w:tc>
+          <w:tcPr>
+            <w:cnfStyle w:val="001000000000" w:firstRow="0" w:lastRow="0" w:firstColumn="1" w:lastColumn="0" w:oddVBand="0" w:evenVBand="0" w:oddHBand="0" w:evenHBand="0" w:firstRowFirstColumn="0" w:firstRowLastColumn="0" w:lastRowFirstColumn="0" w:lastRowLastColumn="0"/>
+            <w:tcW w:w="741" w:type="dxa"/>
+          </w:tcPr>
+          <w:p>
+            <w:pPr>
+              <w:rPr>
+                <w:lang w:val="vi-VN"/>
+              </w:rPr>
+            </w:pPr>
+            <w:r>
+              <w:rPr>
+                <w:lang w:val="vi-VN"/>
+              </w:rPr>
+              <w:lastRenderedPageBreak/>
+              <w:t>3</w:t>
+            </w:r>
+          </w:p>
+        </w:tc>
+        <w:tc>
+          <w:tcPr>
+            <w:tcW w:w="2007" w:type="dxa"/>
+          </w:tcPr>
+          <w:p>
+            <w:pPr>
+              <w:cnfStyle w:val="000000000000" w:firstRow="0" w:lastRow="0" w:firstColumn="0" w:lastColumn="0" w:oddVBand="0" w:evenVBand="0" w:oddHBand="0" w:evenHBand="0" w:firstRowFirstColumn="0" w:firstRowLastColumn="0" w:lastRowFirstColumn="0" w:lastRowLastColumn="0"/>
+              <w:rPr>
+                <w:lang w:val="vi-VN"/>
+              </w:rPr>
+            </w:pPr>
+            <w:r>
+              <w:rPr>
+                <w:lang w:val="vi-VN"/>
+              </w:rPr>
+              <w:t>Quantity</w:t>
+            </w:r>
+          </w:p>
+        </w:tc>
+        <w:tc>
+          <w:tcPr>
+            <w:tcW w:w="1394" w:type="dxa"/>
+          </w:tcPr>
+          <w:p>
+            <w:pPr>
+              <w:cnfStyle w:val="000000000000" w:firstRow="0" w:lastRow="0" w:firstColumn="0" w:lastColumn="0" w:oddVBand="0" w:evenVBand="0" w:oddHBand="0" w:evenHBand="0" w:firstRowFirstColumn="0" w:firstRowLastColumn="0" w:lastRowFirstColumn="0" w:lastRowLastColumn="0"/>
+              <w:rPr>
+                <w:lang w:val="vi-VN"/>
+              </w:rPr>
+            </w:pPr>
+            <w:r>
+              <w:rPr>
+                <w:lang w:val="vi-VN"/>
+              </w:rPr>
+              <w:t>Số lượng tồn</w:t>
+            </w:r>
+          </w:p>
+        </w:tc>
+        <w:tc>
+          <w:tcPr>
+            <w:tcW w:w="2051" w:type="dxa"/>
+          </w:tcPr>
+          <w:p>
+            <w:pPr>
+              <w:cnfStyle w:val="000000000000" w:firstRow="0" w:lastRow="0" w:firstColumn="0" w:lastColumn="0" w:oddVBand="0" w:evenVBand="0" w:oddHBand="0" w:evenHBand="0" w:firstRowFirstColumn="0" w:firstRowLastColumn="0" w:lastRowFirstColumn="0" w:lastRowLastColumn="0"/>
+              <w:rPr>
+                <w:lang w:val="vi-VN"/>
+              </w:rPr>
+            </w:pPr>
+            <w:r>
+              <w:rPr>
+                <w:lang w:val="vi-VN"/>
+              </w:rPr>
+              <w:t>VARCHAR(20)</w:t>
+            </w:r>
+          </w:p>
+        </w:tc>
+        <w:tc>
+          <w:tcPr>
+            <w:tcW w:w="2585" w:type="dxa"/>
+          </w:tcPr>
+          <w:p>
+            <w:pPr>
+              <w:cnfStyle w:val="000000000000" w:firstRow="0" w:lastRow="0" w:firstColumn="0" w:lastColumn="0" w:oddVBand="0" w:evenVBand="0" w:oddHBand="0" w:evenHBand="0" w:firstRowFirstColumn="0" w:firstRowLastColumn="0" w:lastRowFirstColumn="0" w:lastRowLastColumn="0"/>
+              <w:rPr>
+                <w:lang w:val="vi-VN"/>
+              </w:rPr>
+            </w:pPr>
+            <w:r>
+              <w:rPr>
+                <w:lang w:val="vi-VN"/>
+              </w:rPr>
+              <w:t>Not null</w:t>
+            </w:r>
+          </w:p>
+        </w:tc>
+      </w:tr>
+    </w:tbl>
+    <w:p>
+      <w:pPr>
+        <w:rPr>
+          <w:lang w:val="vi-VN"/>
+        </w:rPr>
+      </w:pPr>
+    </w:p>
+    <w:p>
+      <w:pPr>
+        <w:rPr>
+          <w:lang w:val="vi-VN"/>
+        </w:rPr>
+      </w:pPr>
+      <w:r>
+        <w:rPr>
+          <w:lang w:val="vi-VN"/>
+        </w:rPr>
+        <w:t>Thực thể Orders</w:t>
+      </w:r>
+    </w:p>
+    <w:p>
+      <w:r>
+        <w:t xml:space="preserve">Lưu </w:t>
+      </w:r>
+      <w:r>
+        <w:rPr>
+          <w:b/>
+          <w:bCs/>
+        </w:rPr>
+        <w:t>thông tin chung</w:t>
+      </w:r>
+      <w:r>
+        <w:t xml:space="preserve"> của một đơn hàng.</w:t>
+      </w:r>
+    </w:p>
+    <w:p>
+      <w:r>
+        <w:t>Ví dụ khách hàng mua 3 loại sản phẩm thì thông tin khách hàng, ngày mua, tổng tiền... nằm trong Orders.</w:t>
+      </w:r>
+    </w:p>
+    <w:tbl>
+      <w:tblPr>
+        <w:tblStyle w:val="myTable"/>
+        <w:tblW w:w="0" w:type="auto"/>
+        <w:tblLook w:val="04A0" w:firstRow="1" w:lastRow="0" w:firstColumn="1" w:lastColumn="0" w:noHBand="0" w:noVBand="1"/>
+      </w:tblPr>
+      <w:tblGrid>
+        <w:gridCol w:w="741"/>
+        <w:gridCol w:w="2007"/>
+        <w:gridCol w:w="1394"/>
+        <w:gridCol w:w="2051"/>
+        <w:gridCol w:w="2585"/>
+      </w:tblGrid>
+      <w:tr>
+        <w:trPr>
+          <w:cnfStyle w:val="100000000000" w:firstRow="1" w:lastRow="0" w:firstColumn="0" w:lastColumn="0" w:oddVBand="0" w:evenVBand="0" w:oddHBand="0" w:evenHBand="0" w:firstRowFirstColumn="0" w:firstRowLastColumn="0" w:lastRowFirstColumn="0" w:lastRowLastColumn="0"/>
+        </w:trPr>
+        <w:tc>
+          <w:tcPr>
+            <w:cnfStyle w:val="001000000000" w:firstRow="0" w:lastRow="0" w:firstColumn="1" w:lastColumn="0" w:oddVBand="0" w:evenVBand="0" w:oddHBand="0" w:evenHBand="0" w:firstRowFirstColumn="0" w:firstRowLastColumn="0" w:lastRowFirstColumn="0" w:lastRowLastColumn="0"/>
+            <w:tcW w:w="741" w:type="dxa"/>
+          </w:tcPr>
+          <w:p>
+            <w:pPr>
+              <w:rPr>
+                <w:lang w:val="vi-VN"/>
+              </w:rPr>
+            </w:pPr>
+            <w:r>
+              <w:rPr>
+                <w:lang w:val="vi-VN"/>
+              </w:rPr>
+              <w:t>STT</w:t>
+            </w:r>
+          </w:p>
+        </w:tc>
+        <w:tc>
+          <w:tcPr>
+            <w:tcW w:w="2007" w:type="dxa"/>
+          </w:tcPr>
+          <w:p>
+            <w:pPr>
+              <w:cnfStyle w:val="100000000000" w:firstRow="1" w:lastRow="0" w:firstColumn="0" w:lastColumn="0" w:oddVBand="0" w:evenVBand="0" w:oddHBand="0" w:evenHBand="0" w:firstRowFirstColumn="0" w:firstRowLastColumn="0" w:lastRowFirstColumn="0" w:lastRowLastColumn="0"/>
+              <w:rPr>
+                <w:lang w:val="vi-VN"/>
+              </w:rPr>
+            </w:pPr>
+            <w:r>
+              <w:rPr>
+                <w:lang w:val="vi-VN"/>
+              </w:rPr>
+              <w:t>Thuộc tính</w:t>
+            </w:r>
+          </w:p>
+        </w:tc>
+        <w:tc>
+          <w:tcPr>
+            <w:tcW w:w="1394" w:type="dxa"/>
+          </w:tcPr>
+          <w:p>
+            <w:pPr>
+              <w:cnfStyle w:val="100000000000" w:firstRow="1" w:lastRow="0" w:firstColumn="0" w:lastColumn="0" w:oddVBand="0" w:evenVBand="0" w:oddHBand="0" w:evenHBand="0" w:firstRowFirstColumn="0" w:firstRowLastColumn="0" w:lastRowFirstColumn="0" w:lastRowLastColumn="0"/>
+              <w:rPr>
+                <w:lang w:val="vi-VN"/>
+              </w:rPr>
+            </w:pPr>
+            <w:r>
+              <w:rPr>
+                <w:lang w:val="vi-VN"/>
+              </w:rPr>
+              <w:t>Diễn giải</w:t>
+            </w:r>
+          </w:p>
+        </w:tc>
+        <w:tc>
+          <w:tcPr>
+            <w:tcW w:w="2051" w:type="dxa"/>
+          </w:tcPr>
+          <w:p>
+            <w:pPr>
+              <w:cnfStyle w:val="100000000000" w:firstRow="1" w:lastRow="0" w:firstColumn="0" w:lastColumn="0" w:oddVBand="0" w:evenVBand="0" w:oddHBand="0" w:evenHBand="0" w:firstRowFirstColumn="0" w:firstRowLastColumn="0" w:lastRowFirstColumn="0" w:lastRowLastColumn="0"/>
+              <w:rPr>
+                <w:lang w:val="vi-VN"/>
+              </w:rPr>
+            </w:pPr>
+            <w:r>
+              <w:rPr>
+                <w:lang w:val="vi-VN"/>
+              </w:rPr>
+              <w:t>Kiểu dữ liệu</w:t>
+            </w:r>
+          </w:p>
+        </w:tc>
+        <w:tc>
+          <w:tcPr>
+            <w:tcW w:w="2585" w:type="dxa"/>
+          </w:tcPr>
+          <w:p>
+            <w:pPr>
+              <w:cnfStyle w:val="100000000000" w:firstRow="1" w:lastRow="0" w:firstColumn="0" w:lastColumn="0" w:oddVBand="0" w:evenVBand="0" w:oddHBand="0" w:evenHBand="0" w:firstRowFirstColumn="0" w:firstRowLastColumn="0" w:lastRowFirstColumn="0" w:lastRowLastColumn="0"/>
+              <w:rPr>
+                <w:lang w:val="vi-VN"/>
+              </w:rPr>
+            </w:pPr>
+            <w:r>
+              <w:rPr>
+                <w:lang w:val="vi-VN"/>
+              </w:rPr>
+              <w:t>Ràng buộc</w:t>
+            </w:r>
+          </w:p>
+        </w:tc>
+      </w:tr>
+      <w:tr>
+        <w:tc>
+          <w:tcPr>
+            <w:cnfStyle w:val="001000000000" w:firstRow="0" w:lastRow="0" w:firstColumn="1" w:lastColumn="0" w:oddVBand="0" w:evenVBand="0" w:oddHBand="0" w:evenHBand="0" w:firstRowFirstColumn="0" w:firstRowLastColumn="0" w:lastRowFirstColumn="0" w:lastRowLastColumn="0"/>
+            <w:tcW w:w="741" w:type="dxa"/>
+          </w:tcPr>
+          <w:p>
+            <w:pPr>
+              <w:rPr>
+                <w:lang w:val="vi-VN"/>
+              </w:rPr>
+            </w:pPr>
+            <w:r>
+              <w:rPr>
+                <w:lang w:val="vi-VN"/>
+              </w:rPr>
+              <w:t>1</w:t>
+            </w:r>
+          </w:p>
+        </w:tc>
+        <w:tc>
+          <w:tcPr>
+            <w:tcW w:w="2007" w:type="dxa"/>
+          </w:tcPr>
+          <w:p>
+            <w:pPr>
+              <w:cnfStyle w:val="000000000000" w:firstRow="0" w:lastRow="0" w:firstColumn="0" w:lastColumn="0" w:oddVBand="0" w:evenVBand="0" w:oddHBand="0" w:evenHBand="0" w:firstRowFirstColumn="0" w:firstRowLastColumn="0" w:lastRowFirstColumn="0" w:lastRowLastColumn="0"/>
+              <w:rPr>
+                <w:lang w:val="vi-VN"/>
+              </w:rPr>
+            </w:pPr>
+            <w:r>
+              <w:rPr>
+                <w:lang w:val="vi-VN"/>
+              </w:rPr>
+              <w:t>Order</w:t>
+            </w:r>
+            <w:r>
+              <w:rPr>
+                <w:lang w:val="vi-VN"/>
+              </w:rPr>
+              <w:t>Id</w:t>
+            </w:r>
+          </w:p>
+        </w:tc>
+        <w:tc>
+          <w:tcPr>
+            <w:tcW w:w="1394" w:type="dxa"/>
+          </w:tcPr>
+          <w:p>
+            <w:pPr>
+              <w:cnfStyle w:val="000000000000" w:firstRow="0" w:lastRow="0" w:firstColumn="0" w:lastColumn="0" w:oddVBand="0" w:evenVBand="0" w:oddHBand="0" w:evenHBand="0" w:firstRowFirstColumn="0" w:firstRowLastColumn="0" w:lastRowFirstColumn="0" w:lastRowLastColumn="0"/>
+              <w:rPr>
+                <w:lang w:val="vi-VN"/>
+              </w:rPr>
+            </w:pPr>
+            <w:r>
+              <w:rPr>
+                <w:lang w:val="vi-VN"/>
+              </w:rPr>
+              <w:t xml:space="preserve">Mã </w:t>
+            </w:r>
+            <w:r>
+              <w:rPr>
+                <w:lang w:val="vi-VN"/>
+              </w:rPr>
+              <w:t>đơn hàng</w:t>
+            </w:r>
+          </w:p>
+        </w:tc>
+        <w:tc>
+          <w:tcPr>
+            <w:tcW w:w="2051" w:type="dxa"/>
+          </w:tcPr>
+          <w:p>
+            <w:pPr>
+              <w:cnfStyle w:val="000000000000" w:firstRow="0" w:lastRow="0" w:firstColumn="0" w:lastColumn="0" w:oddVBand="0" w:evenVBand="0" w:oddHBand="0" w:evenHBand="0" w:firstRowFirstColumn="0" w:firstRowLastColumn="0" w:lastRowFirstColumn="0" w:lastRowLastColumn="0"/>
+              <w:rPr>
+                <w:lang w:val="vi-VN"/>
+              </w:rPr>
+            </w:pPr>
+            <w:r>
+              <w:rPr>
+                <w:lang w:val="vi-VN"/>
+              </w:rPr>
+              <w:t>INT</w:t>
+            </w:r>
+          </w:p>
+        </w:tc>
+        <w:tc>
+          <w:tcPr>
+            <w:tcW w:w="2585" w:type="dxa"/>
+          </w:tcPr>
+          <w:p>
+            <w:pPr>
+              <w:cnfStyle w:val="000000000000" w:firstRow="0" w:lastRow="0" w:firstColumn="0" w:lastColumn="0" w:oddVBand="0" w:evenVBand="0" w:oddHBand="0" w:evenHBand="0" w:firstRowFirstColumn="0" w:firstRowLastColumn="0" w:lastRowFirstColumn="0" w:lastRowLastColumn="0"/>
+              <w:rPr>
+                <w:lang w:val="vi-VN"/>
+              </w:rPr>
+            </w:pPr>
+            <w:r>
+              <w:rPr>
+                <w:lang w:val="vi-VN"/>
+              </w:rPr>
+              <w:t>PK, AUTO_INCREMENT</w:t>
+            </w:r>
+          </w:p>
+        </w:tc>
+      </w:tr>
+      <w:tr>
+        <w:tc>
+          <w:tcPr>
+            <w:cnfStyle w:val="001000000000" w:firstRow="0" w:lastRow="0" w:firstColumn="1" w:lastColumn="0" w:oddVBand="0" w:evenVBand="0" w:oddHBand="0" w:evenHBand="0" w:firstRowFirstColumn="0" w:firstRowLastColumn="0" w:lastRowFirstColumn="0" w:lastRowLastColumn="0"/>
+            <w:tcW w:w="741" w:type="dxa"/>
+          </w:tcPr>
+          <w:p>
+            <w:pPr>
+              <w:rPr>
+                <w:lang w:val="vi-VN"/>
+              </w:rPr>
+            </w:pPr>
+            <w:r>
+              <w:rPr>
+                <w:lang w:val="vi-VN"/>
+              </w:rPr>
+              <w:t>2</w:t>
+            </w:r>
+          </w:p>
+        </w:tc>
+        <w:tc>
+          <w:tcPr>
+            <w:tcW w:w="2007" w:type="dxa"/>
+          </w:tcPr>
+          <w:p>
+            <w:pPr>
+              <w:cnfStyle w:val="000000000000" w:firstRow="0" w:lastRow="0" w:firstColumn="0" w:lastColumn="0" w:oddVBand="0" w:evenVBand="0" w:oddHBand="0" w:evenHBand="0" w:firstRowFirstColumn="0" w:firstRowLastColumn="0" w:lastRowFirstColumn="0" w:lastRowLastColumn="0"/>
+              <w:rPr>
+                <w:lang w:val="vi-VN"/>
+              </w:rPr>
+            </w:pPr>
+            <w:r>
+              <w:rPr>
+                <w:lang w:val="vi-VN"/>
+              </w:rPr>
+              <w:t>CustomerId</w:t>
+            </w:r>
+          </w:p>
+        </w:tc>
+        <w:tc>
+          <w:tcPr>
+            <w:tcW w:w="1394" w:type="dxa"/>
+          </w:tcPr>
+          <w:p>
+            <w:pPr>
+              <w:cnfStyle w:val="000000000000" w:firstRow="0" w:lastRow="0" w:firstColumn="0" w:lastColumn="0" w:oddVBand="0" w:evenVBand="0" w:oddHBand="0" w:evenHBand="0" w:firstRowFirstColumn="0" w:firstRowLastColumn="0" w:lastRowFirstColumn="0" w:lastRowLastColumn="0"/>
+              <w:rPr>
+                <w:lang w:val="vi-VN"/>
+              </w:rPr>
+            </w:pPr>
+            <w:r>
+              <w:rPr>
+                <w:lang w:val="vi-VN"/>
+              </w:rPr>
+              <w:t>Khách hàng</w:t>
+            </w:r>
+          </w:p>
+        </w:tc>
+        <w:tc>
+          <w:tcPr>
+            <w:tcW w:w="2051" w:type="dxa"/>
+          </w:tcPr>
+          <w:p>
+            <w:pPr>
+              <w:cnfStyle w:val="000000000000" w:firstRow="0" w:lastRow="0" w:firstColumn="0" w:lastColumn="0" w:oddVBand="0" w:evenVBand="0" w:oddHBand="0" w:evenHBand="0" w:firstRowFirstColumn="0" w:firstRowLastColumn="0" w:lastRowFirstColumn="0" w:lastRowLastColumn="0"/>
+              <w:rPr>
+                <w:lang w:val="vi-VN"/>
+              </w:rPr>
+            </w:pPr>
+            <w:r>
+              <w:rPr>
+                <w:lang w:val="vi-VN"/>
+              </w:rPr>
+              <w:t>VARCHAR(150)</w:t>
+            </w:r>
+          </w:p>
+        </w:tc>
+        <w:tc>
+          <w:tcPr>
+            <w:tcW w:w="2585" w:type="dxa"/>
+          </w:tcPr>
+          <w:p>
+            <w:pPr>
+              <w:cnfStyle w:val="000000000000" w:firstRow="0" w:lastRow="0" w:firstColumn="0" w:lastColumn="0" w:oddVBand="0" w:evenVBand="0" w:oddHBand="0" w:evenHBand="0" w:firstRowFirstColumn="0" w:firstRowLastColumn="0" w:lastRowFirstColumn="0" w:lastRowLastColumn="0"/>
+              <w:rPr>
+                <w:lang w:val="vi-VN"/>
+              </w:rPr>
+            </w:pPr>
+            <w:r>
+              <w:rPr>
+                <w:lang w:val="vi-VN"/>
+              </w:rPr>
+              <w:t>Not null</w:t>
+            </w:r>
+          </w:p>
+        </w:tc>
+      </w:tr>
+      <w:tr>
+        <w:tc>
+          <w:tcPr>
+            <w:cnfStyle w:val="001000000000" w:firstRow="0" w:lastRow="0" w:firstColumn="1" w:lastColumn="0" w:oddVBand="0" w:evenVBand="0" w:oddHBand="0" w:evenHBand="0" w:firstRowFirstColumn="0" w:firstRowLastColumn="0" w:lastRowFirstColumn="0" w:lastRowLastColumn="0"/>
+            <w:tcW w:w="741" w:type="dxa"/>
+          </w:tcPr>
+          <w:p>
+            <w:pPr>
+              <w:rPr>
+                <w:lang w:val="vi-VN"/>
+              </w:rPr>
+            </w:pPr>
+            <w:r>
+              <w:rPr>
+                <w:lang w:val="vi-VN"/>
+              </w:rPr>
+              <w:t>3</w:t>
+            </w:r>
+          </w:p>
+        </w:tc>
+        <w:tc>
+          <w:tcPr>
+            <w:tcW w:w="2007" w:type="dxa"/>
+          </w:tcPr>
+          <w:p>
+            <w:pPr>
+              <w:cnfStyle w:val="000000000000" w:firstRow="0" w:lastRow="0" w:firstColumn="0" w:lastColumn="0" w:oddVBand="0" w:evenVBand="0" w:oddHBand="0" w:evenHBand="0" w:firstRowFirstColumn="0" w:firstRowLastColumn="0" w:lastRowFirstColumn="0" w:lastRowLastColumn="0"/>
+              <w:rPr>
+                <w:lang w:val="vi-VN"/>
+              </w:rPr>
+            </w:pPr>
+            <w:r>
+              <w:rPr>
+                <w:lang w:val="vi-VN"/>
+              </w:rPr>
+              <w:t>EmployeeId</w:t>
+            </w:r>
+          </w:p>
+        </w:tc>
+        <w:tc>
+          <w:tcPr>
+            <w:tcW w:w="1394" w:type="dxa"/>
+          </w:tcPr>
+          <w:p>
+            <w:pPr>
+              <w:cnfStyle w:val="000000000000" w:firstRow="0" w:lastRow="0" w:firstColumn="0" w:lastColumn="0" w:oddVBand="0" w:evenVBand="0" w:oddHBand="0" w:evenHBand="0" w:firstRowFirstColumn="0" w:firstRowLastColumn="0" w:lastRowFirstColumn="0" w:lastRowLastColumn="0"/>
+              <w:rPr>
+                <w:lang w:val="vi-VN"/>
+              </w:rPr>
+            </w:pPr>
+            <w:r>
+              <w:rPr>
+                <w:lang w:val="vi-VN"/>
+              </w:rPr>
+              <w:t>Nhân viên lập đơn</w:t>
+            </w:r>
+          </w:p>
+        </w:tc>
+        <w:tc>
+          <w:tcPr>
+            <w:tcW w:w="2051" w:type="dxa"/>
+          </w:tcPr>
+          <w:p>
+            <w:pPr>
+              <w:cnfStyle w:val="000000000000" w:firstRow="0" w:lastRow="0" w:firstColumn="0" w:lastColumn="0" w:oddVBand="0" w:evenVBand="0" w:oddHBand="0" w:evenHBand="0" w:firstRowFirstColumn="0" w:firstRowLastColumn="0" w:lastRowFirstColumn="0" w:lastRowLastColumn="0"/>
+              <w:rPr>
+                <w:lang w:val="vi-VN"/>
+              </w:rPr>
+            </w:pPr>
+            <w:r>
+              <w:rPr>
+                <w:lang w:val="vi-VN"/>
+              </w:rPr>
+              <w:t>VARCHAR(20)</w:t>
+            </w:r>
+          </w:p>
+        </w:tc>
+        <w:tc>
+          <w:tcPr>
+            <w:tcW w:w="2585" w:type="dxa"/>
+          </w:tcPr>
+          <w:p>
+            <w:pPr>
+              <w:cnfStyle w:val="000000000000" w:firstRow="0" w:lastRow="0" w:firstColumn="0" w:lastColumn="0" w:oddVBand="0" w:evenVBand="0" w:oddHBand="0" w:evenHBand="0" w:firstRowFirstColumn="0" w:firstRowLastColumn="0" w:lastRowFirstColumn="0" w:lastRowLastColumn="0"/>
+              <w:rPr>
+                <w:lang w:val="vi-VN"/>
+              </w:rPr>
+            </w:pPr>
+            <w:r>
+              <w:rPr>
+                <w:lang w:val="vi-VN"/>
+              </w:rPr>
+              <w:t>Not null</w:t>
+            </w:r>
+          </w:p>
+        </w:tc>
+      </w:tr>
+      <w:tr>
+        <w:tc>
+          <w:tcPr>
+            <w:cnfStyle w:val="001000000000" w:firstRow="0" w:lastRow="0" w:firstColumn="1" w:lastColumn="0" w:oddVBand="0" w:evenVBand="0" w:oddHBand="0" w:evenHBand="0" w:firstRowFirstColumn="0" w:firstRowLastColumn="0" w:lastRowFirstColumn="0" w:lastRowLastColumn="0"/>
+            <w:tcW w:w="741" w:type="dxa"/>
+          </w:tcPr>
+          <w:p>
+            <w:pPr>
+              <w:rPr>
+                <w:lang w:val="vi-VN"/>
+              </w:rPr>
+            </w:pPr>
+            <w:r>
+              <w:rPr>
+                <w:lang w:val="vi-VN"/>
+              </w:rPr>
+              <w:t>4</w:t>
+            </w:r>
+          </w:p>
+        </w:tc>
+        <w:tc>
+          <w:tcPr>
+            <w:tcW w:w="2007" w:type="dxa"/>
+          </w:tcPr>
+          <w:p>
+            <w:pPr>
+              <w:cnfStyle w:val="000000000000" w:firstRow="0" w:lastRow="0" w:firstColumn="0" w:lastColumn="0" w:oddVBand="0" w:evenVBand="0" w:oddHBand="0" w:evenHBand="0" w:firstRowFirstColumn="0" w:firstRowLastColumn="0" w:lastRowFirstColumn="0" w:lastRowLastColumn="0"/>
+              <w:rPr>
+                <w:lang w:val="vi-VN"/>
+              </w:rPr>
+            </w:pPr>
+            <w:r>
+              <w:rPr>
+                <w:lang w:val="vi-VN"/>
+              </w:rPr>
+              <w:t>OrderDate</w:t>
+            </w:r>
+          </w:p>
+        </w:tc>
+        <w:tc>
+          <w:tcPr>
+            <w:tcW w:w="1394" w:type="dxa"/>
+          </w:tcPr>
+          <w:p>
+            <w:pPr>
+              <w:cnfStyle w:val="000000000000" w:firstRow="0" w:lastRow="0" w:firstColumn="0" w:lastColumn="0" w:oddVBand="0" w:evenVBand="0" w:oddHBand="0" w:evenHBand="0" w:firstRowFirstColumn="0" w:firstRowLastColumn="0" w:lastRowFirstColumn="0" w:lastRowLastColumn="0"/>
+              <w:rPr>
+                <w:lang w:val="vi-VN"/>
+              </w:rPr>
+            </w:pPr>
+            <w:r>
+              <w:rPr>
+                <w:lang w:val="vi-VN"/>
+              </w:rPr>
+              <w:t>Ngày lập đơn</w:t>
+            </w:r>
+          </w:p>
+        </w:tc>
+        <w:tc>
+          <w:tcPr>
+            <w:tcW w:w="2051" w:type="dxa"/>
+          </w:tcPr>
+          <w:p>
+            <w:pPr>
+              <w:cnfStyle w:val="000000000000" w:firstRow="0" w:lastRow="0" w:firstColumn="0" w:lastColumn="0" w:oddVBand="0" w:evenVBand="0" w:oddHBand="0" w:evenHBand="0" w:firstRowFirstColumn="0" w:firstRowLastColumn="0" w:lastRowFirstColumn="0" w:lastRowLastColumn="0"/>
+              <w:rPr>
+                <w:lang w:val="vi-VN"/>
+              </w:rPr>
+            </w:pPr>
+            <w:r>
+              <w:rPr>
+                <w:lang w:val="vi-VN"/>
+              </w:rPr>
+              <w:t>VARCHAR(100)</w:t>
+            </w:r>
+          </w:p>
+        </w:tc>
+        <w:tc>
+          <w:tcPr>
+            <w:tcW w:w="2585" w:type="dxa"/>
+          </w:tcPr>
+          <w:p>
+            <w:pPr>
+              <w:cnfStyle w:val="000000000000" w:firstRow="0" w:lastRow="0" w:firstColumn="0" w:lastColumn="0" w:oddVBand="0" w:evenVBand="0" w:oddHBand="0" w:evenHBand="0" w:firstRowFirstColumn="0" w:firstRowLastColumn="0" w:lastRowFirstColumn="0" w:lastRowLastColumn="0"/>
+              <w:rPr>
+                <w:lang w:val="vi-VN"/>
+              </w:rPr>
+            </w:pPr>
+          </w:p>
+        </w:tc>
+      </w:tr>
+      <w:tr>
+        <w:tc>
+          <w:tcPr>
+            <w:cnfStyle w:val="001000000000" w:firstRow="0" w:lastRow="0" w:firstColumn="1" w:lastColumn="0" w:oddVBand="0" w:evenVBand="0" w:oddHBand="0" w:evenHBand="0" w:firstRowFirstColumn="0" w:firstRowLastColumn="0" w:lastRowFirstColumn="0" w:lastRowLastColumn="0"/>
+            <w:tcW w:w="741" w:type="dxa"/>
+          </w:tcPr>
+          <w:p>
+            <w:pPr>
+              <w:rPr>
+                <w:lang w:val="vi-VN"/>
+              </w:rPr>
+            </w:pPr>
+            <w:r>
+              <w:rPr>
+                <w:lang w:val="vi-VN"/>
+              </w:rPr>
+              <w:t>5</w:t>
+            </w:r>
+          </w:p>
+        </w:tc>
+        <w:tc>
+          <w:tcPr>
+            <w:tcW w:w="2007" w:type="dxa"/>
+          </w:tcPr>
+          <w:p>
+            <w:pPr>
+              <w:cnfStyle w:val="000000000000" w:firstRow="0" w:lastRow="0" w:firstColumn="0" w:lastColumn="0" w:oddVBand="0" w:evenVBand="0" w:oddHBand="0" w:evenHBand="0" w:firstRowFirstColumn="0" w:firstRowLastColumn="0" w:lastRowFirstColumn="0" w:lastRowLastColumn="0"/>
+              <w:rPr>
+                <w:lang w:val="vi-VN"/>
+              </w:rPr>
+            </w:pPr>
+            <w:r>
+              <w:rPr>
+                <w:lang w:val="vi-VN"/>
+              </w:rPr>
+              <w:t>TotalAmount</w:t>
+            </w:r>
+          </w:p>
+        </w:tc>
+        <w:tc>
+          <w:tcPr>
+            <w:tcW w:w="1394" w:type="dxa"/>
+          </w:tcPr>
+          <w:p>
+            <w:pPr>
+              <w:cnfStyle w:val="000000000000" w:firstRow="0" w:lastRow="0" w:firstColumn="0" w:lastColumn="0" w:oddVBand="0" w:evenVBand="0" w:oddHBand="0" w:evenHBand="0" w:firstRowFirstColumn="0" w:firstRowLastColumn="0" w:lastRowFirstColumn="0" w:lastRowLastColumn="0"/>
+              <w:rPr>
+                <w:lang w:val="vi-VN"/>
+              </w:rPr>
+            </w:pPr>
+            <w:r>
+              <w:rPr>
+                <w:lang w:val="vi-VN"/>
+              </w:rPr>
+              <w:t>Tổng tiền</w:t>
+            </w:r>
+          </w:p>
+        </w:tc>
+        <w:tc>
+          <w:tcPr>
+            <w:tcW w:w="2051" w:type="dxa"/>
+          </w:tcPr>
+          <w:p>
+            <w:pPr>
+              <w:cnfStyle w:val="000000000000" w:firstRow="0" w:lastRow="0" w:firstColumn="0" w:lastColumn="0" w:oddVBand="0" w:evenVBand="0" w:oddHBand="0" w:evenHBand="0" w:firstRowFirstColumn="0" w:firstRowLastColumn="0" w:lastRowFirstColumn="0" w:lastRowLastColumn="0"/>
+              <w:rPr>
+                <w:lang w:val="vi-VN"/>
+              </w:rPr>
+            </w:pPr>
+            <w:r>
+              <w:rPr>
+                <w:lang w:val="vi-VN"/>
+              </w:rPr>
+              <w:t>VARCHAR(20)</w:t>
+            </w:r>
+          </w:p>
+        </w:tc>
+        <w:tc>
+          <w:tcPr>
+            <w:tcW w:w="2585" w:type="dxa"/>
+          </w:tcPr>
+          <w:p>
+            <w:pPr>
+              <w:cnfStyle w:val="000000000000" w:firstRow="0" w:lastRow="0" w:firstColumn="0" w:lastColumn="0" w:oddVBand="0" w:evenVBand="0" w:oddHBand="0" w:evenHBand="0" w:firstRowFirstColumn="0" w:firstRowLastColumn="0" w:lastRowFirstColumn="0" w:lastRowLastColumn="0"/>
+              <w:rPr>
+                <w:lang w:val="vi-VN"/>
+              </w:rPr>
+            </w:pPr>
+            <w:r>
+              <w:rPr>
+                <w:lang w:val="vi-VN"/>
+              </w:rPr>
+              <w:t>Not null</w:t>
+            </w:r>
+          </w:p>
+        </w:tc>
+      </w:tr>
+      <w:tr>
+        <w:tc>
+          <w:tcPr>
+            <w:cnfStyle w:val="001000000000" w:firstRow="0" w:lastRow="0" w:firstColumn="1" w:lastColumn="0" w:oddVBand="0" w:evenVBand="0" w:oddHBand="0" w:evenHBand="0" w:firstRowFirstColumn="0" w:firstRowLastColumn="0" w:lastRowFirstColumn="0" w:lastRowLastColumn="0"/>
+            <w:tcW w:w="741" w:type="dxa"/>
+          </w:tcPr>
+          <w:p>
+            <w:pPr>
+              <w:rPr>
+                <w:lang w:val="vi-VN"/>
+              </w:rPr>
+            </w:pPr>
+            <w:r>
+              <w:rPr>
+                <w:lang w:val="vi-VN"/>
+              </w:rPr>
+              <w:t>6</w:t>
+            </w:r>
+          </w:p>
+        </w:tc>
+        <w:tc>
+          <w:tcPr>
+            <w:tcW w:w="2007" w:type="dxa"/>
+          </w:tcPr>
+          <w:p>
+            <w:pPr>
+              <w:cnfStyle w:val="000000000000" w:firstRow="0" w:lastRow="0" w:firstColumn="0" w:lastColumn="0" w:oddVBand="0" w:evenVBand="0" w:oddHBand="0" w:evenHBand="0" w:firstRowFirstColumn="0" w:firstRowLastColumn="0" w:lastRowFirstColumn="0" w:lastRowLastColumn="0"/>
+              <w:rPr>
+                <w:lang w:val="vi-VN"/>
+              </w:rPr>
+            </w:pPr>
+            <w:r>
+              <w:rPr>
+                <w:lang w:val="vi-VN"/>
+              </w:rPr>
+              <w:t>Status</w:t>
+            </w:r>
+          </w:p>
+        </w:tc>
+        <w:tc>
+          <w:tcPr>
+            <w:tcW w:w="1394" w:type="dxa"/>
+          </w:tcPr>
+          <w:p>
+            <w:pPr>
+              <w:cnfStyle w:val="000000000000" w:firstRow="0" w:lastRow="0" w:firstColumn="0" w:lastColumn="0" w:oddVBand="0" w:evenVBand="0" w:oddHBand="0" w:evenHBand="0" w:firstRowFirstColumn="0" w:firstRowLastColumn="0" w:lastRowFirstColumn="0" w:lastRowLastColumn="0"/>
+              <w:rPr>
+                <w:lang w:val="vi-VN"/>
+              </w:rPr>
+            </w:pPr>
+            <w:r>
+              <w:rPr>
+                <w:lang w:val="vi-VN"/>
+              </w:rPr>
+              <w:t>Trạng thái</w:t>
+            </w:r>
+          </w:p>
+        </w:tc>
+        <w:tc>
+          <w:tcPr>
+            <w:tcW w:w="2051" w:type="dxa"/>
+          </w:tcPr>
+          <w:p>
+            <w:pPr>
+              <w:cnfStyle w:val="000000000000" w:firstRow="0" w:lastRow="0" w:firstColumn="0" w:lastColumn="0" w:oddVBand="0" w:evenVBand="0" w:oddHBand="0" w:evenHBand="0" w:firstRowFirstColumn="0" w:firstRowLastColumn="0" w:lastRowFirstColumn="0" w:lastRowLastColumn="0"/>
+              <w:rPr>
+                <w:lang w:val="vi-VN"/>
+              </w:rPr>
+            </w:pPr>
+          </w:p>
+        </w:tc>
+        <w:tc>
+          <w:tcPr>
+            <w:tcW w:w="2585" w:type="dxa"/>
           </w:tcPr>
           <w:p>
             <w:pPr>
@@ -2864,7 +5427,7 @@
 </file>
 
 <file path=word/endnotes.xml><?xml version="1.0" encoding="utf-8"?>
-<w:endnotes xmlns:wpc="http://schemas.microsoft.com/office/word/2010/wordprocessingCanvas" xmlns:mc="http://schemas.openxmlformats.org/markup-compatibility/2006" xmlns:o="urn:schemas-microsoft-com:office:office" xmlns:r="http://schemas.openxmlformats.org/officeDocument/2006/relationships" xmlns:m="http://schemas.openxmlformats.org/officeDocument/2006/math" xmlns:v="urn:schemas-microsoft-com:vml" xmlns:wp14="http://schemas.microsoft.com/office/word/2010/wordprocessingDrawing" xmlns:wp="http://schemas.openxmlformats.org/drawingml/2006/wordprocessingDrawing" xmlns:w10="urn:schemas-microsoft-com:office:word" xmlns:w="http://schemas.openxmlformats.org/wordprocessingml/2006/main" xmlns:w14="http://schemas.microsoft.com/office/word/2010/wordml" xmlns:w15="http://schemas.microsoft.com/office/word/2012/wordml" xmlns:wpg="http://schemas.microsoft.com/office/word/2010/wordprocessingGroup" xmlns:wpi="http://schemas.microsoft.com/office/word/2010/wordprocessingInk" xmlns:wne="http://schemas.microsoft.com/office/word/2006/wordml" xmlns:wps="http://schemas.microsoft.com/office/word/2010/wordprocessingShape" mc:Ignorable="w14 w15 wp14">
+<w:endnotes xmlns:wpc="http://schemas.microsoft.com/office/word/2010/wordprocessingCanvas" xmlns:cx="http://schemas.microsoft.com/office/drawing/2014/chartex" xmlns:cx1="http://schemas.microsoft.com/office/drawing/2015/9/8/chartex" xmlns:cx2="http://schemas.microsoft.com/office/drawing/2015/10/21/chartex" xmlns:cx3="http://schemas.microsoft.com/office/drawing/2016/5/9/chartex" xmlns:cx4="http://schemas.microsoft.com/office/drawing/2016/5/10/chartex" xmlns:cx5="http://schemas.microsoft.com/office/drawing/2016/5/11/chartex" xmlns:cx6="http://schemas.microsoft.com/office/drawing/2016/5/12/chartex" xmlns:cx7="http://schemas.microsoft.com/office/drawing/2016/5/13/chartex" xmlns:cx8="http://schemas.microsoft.com/office/drawing/2016/5/14/chartex" xmlns:mc="http://schemas.openxmlformats.org/markup-compatibility/2006" xmlns:aink="http://schemas.microsoft.com/office/drawing/2016/ink" xmlns:am3d="http://schemas.microsoft.com/office/drawing/2017/model3d" xmlns:o="urn:schemas-microsoft-com:office:office" xmlns:oel="http://schemas.microsoft.com/office/2019/extlst" xmlns:r="http://schemas.openxmlformats.org/officeDocument/2006/relationships" xmlns:m="http://schemas.openxmlformats.org/officeDocument/2006/math" xmlns:v="urn:schemas-microsoft-com:vml" xmlns:wp14="http://schemas.microsoft.com/office/word/2010/wordprocessingDrawing" xmlns:wp="http://schemas.openxmlformats.org/drawingml/2006/wordprocessingDrawing" xmlns:w10="urn:schemas-microsoft-com:office:word" xmlns:w="http://schemas.openxmlformats.org/wordprocessingml/2006/main" xmlns:w14="http://schemas.microsoft.com/office/word/2010/wordml" xmlns:w15="http://schemas.microsoft.com/office/word/2012/wordml" xmlns:w16cex="http://schemas.microsoft.com/office/word/2018/wordml/cex" xmlns:w16cid="http://schemas.microsoft.com/office/word/2016/wordml/cid" xmlns:w16="http://schemas.microsoft.com/office/word/2018/wordml" xmlns:w16du="http://schemas.microsoft.com/office/word/2023/wordml/word16du" xmlns:w16sdtdh="http://schemas.microsoft.com/office/word/2020/wordml/sdtdatahash" xmlns:w16sdtfl="http://schemas.microsoft.com/office/word/2024/wordml/sdtformatlock" xmlns:w16se="http://schemas.microsoft.com/office/word/2015/wordml/symex" xmlns:wpg="http://schemas.microsoft.com/office/word/2010/wordprocessingGroup" xmlns:wpi="http://schemas.microsoft.com/office/word/2010/wordprocessingInk" xmlns:wne="http://schemas.microsoft.com/office/word/2006/wordml" xmlns:wps="http://schemas.microsoft.com/office/word/2010/wordprocessingShape" mc:Ignorable="w14 w15 w16se w16cid w16 w16cex w16sdtdh w16sdtfl w16du wp14">
   <w:endnote w:type="separator" w:id="-1">
     <w:p>
       <w:pPr>
@@ -2889,7 +5452,7 @@
 </file>
 
 <file path=word/footnotes.xml><?xml version="1.0" encoding="utf-8"?>
-<w:footnotes xmlns:wpc="http://schemas.microsoft.com/office/word/2010/wordprocessingCanvas" xmlns:mc="http://schemas.openxmlformats.org/markup-compatibility/2006" xmlns:o="urn:schemas-microsoft-com:office:office" xmlns:r="http://schemas.openxmlformats.org/officeDocument/2006/relationships" xmlns:m="http://schemas.openxmlformats.org/officeDocument/2006/math" xmlns:v="urn:schemas-microsoft-com:vml" xmlns:wp14="http://schemas.microsoft.com/office/word/2010/wordprocessingDrawing" xmlns:wp="http://schemas.openxmlformats.org/drawingml/2006/wordprocessingDrawing" xmlns:w10="urn:schemas-microsoft-com:office:word" xmlns:w="http://schemas.openxmlformats.org/wordprocessingml/2006/main" xmlns:w14="http://schemas.microsoft.com/office/word/2010/wordml" xmlns:w15="http://schemas.microsoft.com/office/word/2012/wordml" xmlns:wpg="http://schemas.microsoft.com/office/word/2010/wordprocessingGroup" xmlns:wpi="http://schemas.microsoft.com/office/word/2010/wordprocessingInk" xmlns:wne="http://schemas.microsoft.com/office/word/2006/wordml" xmlns:wps="http://schemas.microsoft.com/office/word/2010/wordprocessingShape" mc:Ignorable="w14 w15 wp14">
+<w:footnotes xmlns:wpc="http://schemas.microsoft.com/office/word/2010/wordprocessingCanvas" xmlns:cx="http://schemas.microsoft.com/office/drawing/2014/chartex" xmlns:cx1="http://schemas.microsoft.com/office/drawing/2015/9/8/chartex" xmlns:cx2="http://schemas.microsoft.com/office/drawing/2015/10/21/chartex" xmlns:cx3="http://schemas.microsoft.com/office/drawing/2016/5/9/chartex" xmlns:cx4="http://schemas.microsoft.com/office/drawing/2016/5/10/chartex" xmlns:cx5="http://schemas.microsoft.com/office/drawing/2016/5/11/chartex" xmlns:cx6="http://schemas.microsoft.com/office/drawing/2016/5/12/chartex" xmlns:cx7="http://schemas.microsoft.com/office/drawing/2016/5/13/chartex" xmlns:cx8="http://schemas.microsoft.com/office/drawing/2016/5/14/chartex" xmlns:mc="http://schemas.openxmlformats.org/markup-compatibility/2006" xmlns:aink="http://schemas.microsoft.com/office/drawing/2016/ink" xmlns:am3d="http://schemas.microsoft.com/office/drawing/2017/model3d" xmlns:o="urn:schemas-microsoft-com:office:office" xmlns:oel="http://schemas.microsoft.com/office/2019/extlst" xmlns:r="http://schemas.openxmlformats.org/officeDocument/2006/relationships" xmlns:m="http://schemas.openxmlformats.org/officeDocument/2006/math" xmlns:v="urn:schemas-microsoft-com:vml" xmlns:wp14="http://schemas.microsoft.com/office/word/2010/wordprocessingDrawing" xmlns:wp="http://schemas.openxmlformats.org/drawingml/2006/wordprocessingDrawing" xmlns:w10="urn:schemas-microsoft-com:office:word" xmlns:w="http://schemas.openxmlformats.org/wordprocessingml/2006/main" xmlns:w14="http://schemas.microsoft.com/office/word/2010/wordml" xmlns:w15="http://schemas.microsoft.com/office/word/2012/wordml" xmlns:w16cex="http://schemas.microsoft.com/office/word/2018/wordml/cex" xmlns:w16cid="http://schemas.microsoft.com/office/word/2016/wordml/cid" xmlns:w16="http://schemas.microsoft.com/office/word/2018/wordml" xmlns:w16du="http://schemas.microsoft.com/office/word/2023/wordml/word16du" xmlns:w16sdtdh="http://schemas.microsoft.com/office/word/2020/wordml/sdtdatahash" xmlns:w16sdtfl="http://schemas.microsoft.com/office/word/2024/wordml/sdtformatlock" xmlns:w16se="http://schemas.microsoft.com/office/word/2015/wordml/symex" xmlns:wpg="http://schemas.microsoft.com/office/word/2010/wordprocessingGroup" xmlns:wpi="http://schemas.microsoft.com/office/word/2010/wordprocessingInk" xmlns:wne="http://schemas.microsoft.com/office/word/2006/wordml" xmlns:wps="http://schemas.microsoft.com/office/word/2010/wordprocessingShape" mc:Ignorable="w14 w15 w16se w16cid w16 w16cex w16sdtdh w16sdtfl w16du wp14">
   <w:footnote w:type="separator" w:id="-1">
     <w:p>
       <w:pPr>
@@ -2914,8 +5477,157 @@
 </file>
 
 <file path=word/numbering.xml><?xml version="1.0" encoding="utf-8"?>
-<w:numbering xmlns:wpc="http://schemas.microsoft.com/office/word/2010/wordprocessingCanvas" xmlns:mc="http://schemas.openxmlformats.org/markup-compatibility/2006" xmlns:o="urn:schemas-microsoft-com:office:office" xmlns:r="http://schemas.openxmlformats.org/officeDocument/2006/relationships" xmlns:m="http://schemas.openxmlformats.org/officeDocument/2006/math" xmlns:v="urn:schemas-microsoft-com:vml" xmlns:wp14="http://schemas.microsoft.com/office/word/2010/wordprocessingDrawing" xmlns:wp="http://schemas.openxmlformats.org/drawingml/2006/wordprocessingDrawing" xmlns:w10="urn:schemas-microsoft-com:office:word" xmlns:w="http://schemas.openxmlformats.org/wordprocessingml/2006/main" xmlns:w14="http://schemas.microsoft.com/office/word/2010/wordml" xmlns:w15="http://schemas.microsoft.com/office/word/2012/wordml" xmlns:wpg="http://schemas.microsoft.com/office/word/2010/wordprocessingGroup" xmlns:wpi="http://schemas.microsoft.com/office/word/2010/wordprocessingInk" xmlns:wne="http://schemas.microsoft.com/office/word/2006/wordml" xmlns:wps="http://schemas.microsoft.com/office/word/2010/wordprocessingShape" mc:Ignorable="w14 w15 wp14">
-  <w:abstractNum w:abstractNumId="0">
+<w:numbering xmlns:wpc="http://schemas.microsoft.com/office/word/2010/wordprocessingCanvas" xmlns:cx="http://schemas.microsoft.com/office/drawing/2014/chartex" xmlns:cx1="http://schemas.microsoft.com/office/drawing/2015/9/8/chartex" xmlns:cx2="http://schemas.microsoft.com/office/drawing/2015/10/21/chartex" xmlns:cx3="http://schemas.microsoft.com/office/drawing/2016/5/9/chartex" xmlns:cx4="http://schemas.microsoft.com/office/drawing/2016/5/10/chartex" xmlns:cx5="http://schemas.microsoft.com/office/drawing/2016/5/11/chartex" xmlns:cx6="http://schemas.microsoft.com/office/drawing/2016/5/12/chartex" xmlns:cx7="http://schemas.microsoft.com/office/drawing/2016/5/13/chartex" xmlns:cx8="http://schemas.microsoft.com/office/drawing/2016/5/14/chartex" xmlns:mc="http://schemas.openxmlformats.org/markup-compatibility/2006" xmlns:aink="http://schemas.microsoft.com/office/drawing/2016/ink" xmlns:am3d="http://schemas.microsoft.com/office/drawing/2017/model3d" xmlns:o="urn:schemas-microsoft-com:office:office" xmlns:oel="http://schemas.microsoft.com/office/2019/extlst" xmlns:r="http://schemas.openxmlformats.org/officeDocument/2006/relationships" xmlns:m="http://schemas.openxmlformats.org/officeDocument/2006/math" xmlns:v="urn:schemas-microsoft-com:vml" xmlns:wp14="http://schemas.microsoft.com/office/word/2010/wordprocessingDrawing" xmlns:wp="http://schemas.openxmlformats.org/drawingml/2006/wordprocessingDrawing" xmlns:w10="urn:schemas-microsoft-com:office:word" xmlns:w="http://schemas.openxmlformats.org/wordprocessingml/2006/main" xmlns:w14="http://schemas.microsoft.com/office/word/2010/wordml" xmlns:w15="http://schemas.microsoft.com/office/word/2012/wordml" xmlns:w16cex="http://schemas.microsoft.com/office/word/2018/wordml/cex" xmlns:w16cid="http://schemas.microsoft.com/office/word/2016/wordml/cid" xmlns:w16="http://schemas.microsoft.com/office/word/2018/wordml" xmlns:w16du="http://schemas.microsoft.com/office/word/2023/wordml/word16du" xmlns:w16sdtdh="http://schemas.microsoft.com/office/word/2020/wordml/sdtdatahash" xmlns:w16sdtfl="http://schemas.microsoft.com/office/word/2024/wordml/sdtformatlock" xmlns:w16se="http://schemas.microsoft.com/office/word/2015/wordml/symex" xmlns:wpg="http://schemas.microsoft.com/office/word/2010/wordprocessingGroup" xmlns:wpi="http://schemas.microsoft.com/office/word/2010/wordprocessingInk" xmlns:wne="http://schemas.microsoft.com/office/word/2006/wordml" xmlns:wps="http://schemas.microsoft.com/office/word/2010/wordprocessingShape" mc:Ignorable="w14 w15 w16se w16cid w16 w16cex w16sdtdh w16sdtfl w16du wp14">
+  <w:abstractNum w:abstractNumId="0" w15:restartNumberingAfterBreak="0">
+    <w:nsid w:val="05A4278C"/>
+    <w:multiLevelType w:val="multilevel"/>
+    <w:tmpl w:val="A2924212"/>
+    <w:lvl w:ilvl="0">
+      <w:start w:val="1"/>
+      <w:numFmt w:val="bullet"/>
+      <w:lvlText w:val=""/>
+      <w:lvlJc w:val="left"/>
+      <w:pPr>
+        <w:tabs>
+          <w:tab w:val="num" w:pos="720"/>
+        </w:tabs>
+        <w:ind w:left="720" w:hanging="360"/>
+      </w:pPr>
+      <w:rPr>
+        <w:rFonts w:ascii="Symbol" w:hAnsi="Symbol" w:hint="default"/>
+        <w:sz w:val="20"/>
+      </w:rPr>
+    </w:lvl>
+    <w:lvl w:ilvl="1" w:tentative="1">
+      <w:start w:val="1"/>
+      <w:numFmt w:val="bullet"/>
+      <w:lvlText w:val="o"/>
+      <w:lvlJc w:val="left"/>
+      <w:pPr>
+        <w:tabs>
+          <w:tab w:val="num" w:pos="1440"/>
+        </w:tabs>
+        <w:ind w:left="1440" w:hanging="360"/>
+      </w:pPr>
+      <w:rPr>
+        <w:rFonts w:ascii="Courier New" w:hAnsi="Courier New" w:hint="default"/>
+        <w:sz w:val="20"/>
+      </w:rPr>
+    </w:lvl>
+    <w:lvl w:ilvl="2" w:tentative="1">
+      <w:start w:val="1"/>
+      <w:numFmt w:val="bullet"/>
+      <w:lvlText w:val=""/>
+      <w:lvlJc w:val="left"/>
+      <w:pPr>
+        <w:tabs>
+          <w:tab w:val="num" w:pos="2160"/>
+        </w:tabs>
+        <w:ind w:left="2160" w:hanging="360"/>
+      </w:pPr>
+      <w:rPr>
+        <w:rFonts w:ascii="Wingdings" w:hAnsi="Wingdings" w:hint="default"/>
+        <w:sz w:val="20"/>
+      </w:rPr>
+    </w:lvl>
+    <w:lvl w:ilvl="3" w:tentative="1">
+      <w:start w:val="1"/>
+      <w:numFmt w:val="bullet"/>
+      <w:lvlText w:val=""/>
+      <w:lvlJc w:val="left"/>
+      <w:pPr>
+        <w:tabs>
+          <w:tab w:val="num" w:pos="2880"/>
+        </w:tabs>
+        <w:ind w:left="2880" w:hanging="360"/>
+      </w:pPr>
+      <w:rPr>
+        <w:rFonts w:ascii="Wingdings" w:hAnsi="Wingdings" w:hint="default"/>
+        <w:sz w:val="20"/>
+      </w:rPr>
+    </w:lvl>
+    <w:lvl w:ilvl="4" w:tentative="1">
+      <w:start w:val="1"/>
+      <w:numFmt w:val="bullet"/>
+      <w:lvlText w:val=""/>
+      <w:lvlJc w:val="left"/>
+      <w:pPr>
+        <w:tabs>
+          <w:tab w:val="num" w:pos="3600"/>
+        </w:tabs>
+        <w:ind w:left="3600" w:hanging="360"/>
+      </w:pPr>
+      <w:rPr>
+        <w:rFonts w:ascii="Wingdings" w:hAnsi="Wingdings" w:hint="default"/>
+        <w:sz w:val="20"/>
+      </w:rPr>
+    </w:lvl>
+    <w:lvl w:ilvl="5" w:tentative="1">
+      <w:start w:val="1"/>
+      <w:numFmt w:val="bullet"/>
+      <w:lvlText w:val=""/>
+      <w:lvlJc w:val="left"/>
+      <w:pPr>
+        <w:tabs>
+          <w:tab w:val="num" w:pos="4320"/>
+        </w:tabs>
+        <w:ind w:left="4320" w:hanging="360"/>
+      </w:pPr>
+      <w:rPr>
+        <w:rFonts w:ascii="Wingdings" w:hAnsi="Wingdings" w:hint="default"/>
+        <w:sz w:val="20"/>
+      </w:rPr>
+    </w:lvl>
+    <w:lvl w:ilvl="6" w:tentative="1">
+      <w:start w:val="1"/>
+      <w:numFmt w:val="bullet"/>
+      <w:lvlText w:val=""/>
+      <w:lvlJc w:val="left"/>
+      <w:pPr>
+        <w:tabs>
+          <w:tab w:val="num" w:pos="5040"/>
+        </w:tabs>
+        <w:ind w:left="5040" w:hanging="360"/>
+      </w:pPr>
+      <w:rPr>
+        <w:rFonts w:ascii="Wingdings" w:hAnsi="Wingdings" w:hint="default"/>
+        <w:sz w:val="20"/>
+      </w:rPr>
+    </w:lvl>
+    <w:lvl w:ilvl="7" w:tentative="1">
+      <w:start w:val="1"/>
+      <w:numFmt w:val="bullet"/>
+      <w:lvlText w:val=""/>
+      <w:lvlJc w:val="left"/>
+      <w:pPr>
+        <w:tabs>
+          <w:tab w:val="num" w:pos="5760"/>
+        </w:tabs>
+        <w:ind w:left="5760" w:hanging="360"/>
+      </w:pPr>
+      <w:rPr>
+        <w:rFonts w:ascii="Wingdings" w:hAnsi="Wingdings" w:hint="default"/>
+        <w:sz w:val="20"/>
+      </w:rPr>
+    </w:lvl>
+    <w:lvl w:ilvl="8" w:tentative="1">
+      <w:start w:val="1"/>
+      <w:numFmt w:val="bullet"/>
+      <w:lvlText w:val=""/>
+      <w:lvlJc w:val="left"/>
+      <w:pPr>
+        <w:tabs>
+          <w:tab w:val="num" w:pos="6480"/>
+        </w:tabs>
+        <w:ind w:left="6480" w:hanging="360"/>
+      </w:pPr>
+      <w:rPr>
+        <w:rFonts w:ascii="Wingdings" w:hAnsi="Wingdings" w:hint="default"/>
+        <w:sz w:val="20"/>
+      </w:rPr>
+    </w:lvl>
+  </w:abstractNum>
+  <w:abstractNum w:abstractNumId="1" w15:restartNumberingAfterBreak="0">
     <w:nsid w:val="18C8737C"/>
     <w:multiLevelType w:val="multilevel"/>
     <w:tmpl w:val="4F8C10D0"/>
@@ -3057,26 +5769,29 @@
       </w:rPr>
     </w:lvl>
   </w:abstractNum>
-  <w:num w:numId="1">
-    <w:abstractNumId w:val="0"/>
+  <w:num w:numId="1" w16cid:durableId="415321920">
+    <w:abstractNumId w:val="1"/>
   </w:num>
-  <w:num w:numId="2">
-    <w:abstractNumId w:val="0"/>
+  <w:num w:numId="2" w16cid:durableId="355354325">
+    <w:abstractNumId w:val="1"/>
   </w:num>
-  <w:num w:numId="3">
-    <w:abstractNumId w:val="0"/>
+  <w:num w:numId="3" w16cid:durableId="1260677543">
+    <w:abstractNumId w:val="1"/>
   </w:num>
-  <w:num w:numId="4">
-    <w:abstractNumId w:val="0"/>
+  <w:num w:numId="4" w16cid:durableId="479541297">
+    <w:abstractNumId w:val="1"/>
   </w:num>
-  <w:num w:numId="5">
+  <w:num w:numId="5" w16cid:durableId="2040928398">
+    <w:abstractNumId w:val="1"/>
+  </w:num>
+  <w:num w:numId="6" w16cid:durableId="184832033">
     <w:abstractNumId w:val="0"/>
   </w:num>
 </w:numbering>
 </file>
 
 <file path=word/styles.xml><?xml version="1.0" encoding="utf-8"?>
-<w:styles xmlns:mc="http://schemas.openxmlformats.org/markup-compatibility/2006" xmlns:r="http://schemas.openxmlformats.org/officeDocument/2006/relationships" xmlns:w="http://schemas.openxmlformats.org/wordprocessingml/2006/main" xmlns:w14="http://schemas.microsoft.com/office/word/2010/wordml" xmlns:w15="http://schemas.microsoft.com/office/word/2012/wordml" mc:Ignorable="w14 w15">
+<w:styles xmlns:mc="http://schemas.openxmlformats.org/markup-compatibility/2006" xmlns:r="http://schemas.openxmlformats.org/officeDocument/2006/relationships" xmlns:w="http://schemas.openxmlformats.org/wordprocessingml/2006/main" xmlns:w14="http://schemas.microsoft.com/office/word/2010/wordml" xmlns:w15="http://schemas.microsoft.com/office/word/2012/wordml" xmlns:w16cex="http://schemas.microsoft.com/office/word/2018/wordml/cex" xmlns:w16cid="http://schemas.microsoft.com/office/word/2016/wordml/cid" xmlns:w16="http://schemas.microsoft.com/office/word/2018/wordml" xmlns:w16du="http://schemas.microsoft.com/office/word/2023/wordml/word16du" xmlns:w16sdtdh="http://schemas.microsoft.com/office/word/2020/wordml/sdtdatahash" xmlns:w16sdtfl="http://schemas.microsoft.com/office/word/2024/wordml/sdtformatlock" xmlns:w16se="http://schemas.microsoft.com/office/word/2015/wordml/symex" mc:Ignorable="w14 w15 w16se w16cid w16 w16cex w16sdtdh w16sdtfl w16du">
   <w:docDefaults>
     <w:rPrDefault>
       <w:rPr>
@@ -3092,7 +5807,7 @@
       </w:pPr>
     </w:pPrDefault>
   </w:docDefaults>
-  <w:latentStyles w:defLockedState="0" w:defUIPriority="99" w:defSemiHidden="0" w:defUnhideWhenUsed="0" w:defQFormat="0" w:count="371">
+  <w:latentStyles w:defLockedState="0" w:defUIPriority="99" w:defSemiHidden="0" w:defUnhideWhenUsed="0" w:defQFormat="0" w:count="376">
     <w:lsdException w:name="Normal" w:uiPriority="0" w:qFormat="1"/>
     <w:lsdException w:name="heading 1" w:uiPriority="9" w:qFormat="1"/>
     <w:lsdException w:name="heading 2" w:semiHidden="1" w:uiPriority="9" w:unhideWhenUsed="1" w:qFormat="1"/>
@@ -3464,10 +6179,16 @@
     <w:lsdException w:name="List Table 5 Dark Accent 6" w:uiPriority="50"/>
     <w:lsdException w:name="List Table 6 Colorful Accent 6" w:uiPriority="51"/>
     <w:lsdException w:name="List Table 7 Colorful Accent 6" w:uiPriority="52"/>
+    <w:lsdException w:name="Mention" w:semiHidden="1" w:unhideWhenUsed="1"/>
+    <w:lsdException w:name="Smart Hyperlink" w:semiHidden="1" w:unhideWhenUsed="1"/>
+    <w:lsdException w:name="Hashtag" w:semiHidden="1" w:unhideWhenUsed="1"/>
+    <w:lsdException w:name="Unresolved Mention" w:semiHidden="1" w:unhideWhenUsed="1"/>
+    <w:lsdException w:name="Smart Link" w:semiHidden="1" w:unhideWhenUsed="1"/>
   </w:latentStyles>
   <w:style w:type="paragraph" w:default="1" w:styleId="Normal">
     <w:name w:val="Normal"/>
     <w:qFormat/>
+    <w:rsid w:val="00E776FD"/>
   </w:style>
   <w:style w:type="paragraph" w:styleId="Heading1">
     <w:name w:val="heading 1"/>
@@ -3715,7 +6436,6 @@
   <w:style w:type="character" w:default="1" w:styleId="DefaultParagraphFont">
     <w:name w:val="Default Paragraph Font"/>
     <w:uiPriority w:val="1"/>
-    <w:semiHidden/>
     <w:unhideWhenUsed/>
   </w:style>
   <w:style w:type="table" w:default="1" w:styleId="TableNormal">
@@ -3957,7 +6677,6 @@
       <w:spacing w:after="0" w:line="240" w:lineRule="auto"/>
     </w:pPr>
     <w:tblPr>
-      <w:tblInd w:w="0" w:type="dxa"/>
       <w:tblBorders>
         <w:top w:val="single" w:sz="4" w:space="0" w:color="auto"/>
         <w:left w:val="single" w:sz="4" w:space="0" w:color="auto"/>
@@ -3966,12 +6685,6 @@
         <w:insideH w:val="single" w:sz="4" w:space="0" w:color="auto"/>
         <w:insideV w:val="single" w:sz="4" w:space="0" w:color="auto"/>
       </w:tblBorders>
-      <w:tblCellMar>
-        <w:top w:w="0" w:type="dxa"/>
-        <w:left w:w="108" w:type="dxa"/>
-        <w:bottom w:w="0" w:type="dxa"/>
-        <w:right w:w="108" w:type="dxa"/>
-      </w:tblCellMar>
     </w:tblPr>
   </w:style>
   <w:style w:type="table" w:customStyle="1" w:styleId="myTable">
@@ -3986,7 +6699,6 @@
       <w:sz w:val="26"/>
     </w:rPr>
     <w:tblPr>
-      <w:tblInd w:w="0" w:type="dxa"/>
       <w:tblBorders>
         <w:top w:val="single" w:sz="4" w:space="0" w:color="auto"/>
         <w:left w:val="single" w:sz="4" w:space="0" w:color="auto"/>
@@ -3997,9 +6709,7 @@
       </w:tblBorders>
       <w:tblCellMar>
         <w:top w:w="57" w:type="dxa"/>
-        <w:left w:w="108" w:type="dxa"/>
         <w:bottom w:w="57" w:type="dxa"/>
-        <w:right w:w="108" w:type="dxa"/>
       </w:tblCellMar>
     </w:tblPr>
     <w:tcPr>

</xml_diff>